<commit_message>
chore: add temporary and backup files for multi-cloud research paper
</commit_message>
<xml_diff>
--- a/Multi_Cloud_Research_Paper_Final - Copy.docx
+++ b/Multi_Cloud_Research_Paper_Final - Copy.docx
@@ -35,6 +35,173 @@
           <w:szCs w:val="18"/>
         </w:rPr>
       </w:pPr>
+    </w:p>
+    <w:p>
+      <w:pPr>
+        <w:ind w:left="243" w:right="243"/>
+        <w:jc w:val="center"/>
+        <w:rPr>
+          <w:sz w:val="24"/>
+          <w:szCs w:val="24"/>
+          <w:vertAlign w:val="superscript"/>
+        </w:rPr>
+      </w:pPr>
+      <w:r>
+        <w:rPr>
+          <w:sz w:val="24"/>
+          <w:szCs w:val="24"/>
+        </w:rPr>
+        <w:t>Priyanshu Kumar Sharma</w:t>
+      </w:r>
+      <w:r>
+        <w:rPr>
+          <w:sz w:val="24"/>
+          <w:szCs w:val="24"/>
+          <w:vertAlign w:val="superscript"/>
+        </w:rPr>
+        <w:t>1</w:t>
+      </w:r>
+      <w:r>
+        <w:rPr>
+          <w:sz w:val="24"/>
+          <w:szCs w:val="24"/>
+        </w:rPr>
+        <w:t>, Vaishnavi Jadhav</w:t>
+      </w:r>
+      <w:r>
+        <w:rPr>
+          <w:sz w:val="24"/>
+          <w:szCs w:val="24"/>
+          <w:vertAlign w:val="superscript"/>
+        </w:rPr>
+        <w:t>2</w:t>
+      </w:r>
+      <w:r>
+        <w:rPr>
+          <w:sz w:val="24"/>
+          <w:szCs w:val="24"/>
+        </w:rPr>
+        <w:t>, Vaibhav Gulge</w:t>
+      </w:r>
+      <w:r>
+        <w:rPr>
+          <w:sz w:val="24"/>
+          <w:szCs w:val="24"/>
+          <w:vertAlign w:val="superscript"/>
+        </w:rPr>
+        <w:t>3</w:t>
+      </w:r>
+      <w:r>
+        <w:rPr>
+          <w:sz w:val="24"/>
+          <w:szCs w:val="24"/>
+        </w:rPr>
+        <w:t>, Prini Rastogi</w:t>
+      </w:r>
+      <w:r>
+        <w:rPr>
+          <w:sz w:val="24"/>
+          <w:szCs w:val="24"/>
+          <w:vertAlign w:val="superscript"/>
+        </w:rPr>
+        <w:t>4</w:t>
+      </w:r>
+    </w:p>
+    <w:p>
+      <w:pPr>
+        <w:ind w:left="243" w:right="243"/>
+        <w:jc w:val="center"/>
+        <w:rPr>
+          <w:i/>
+          <w:iCs/>
+        </w:rPr>
+      </w:pPr>
+      <w:r>
+        <w:rPr>
+          <w:i/>
+          <w:iCs/>
+        </w:rPr>
+        <w:t>Student</w:t>
+      </w:r>
+      <w:r>
+        <w:rPr>
+          <w:i/>
+          <w:iCs/>
+          <w:vertAlign w:val="superscript"/>
+        </w:rPr>
+        <w:t>1,2,3</w:t>
+      </w:r>
+      <w:r>
+        <w:rPr>
+          <w:i/>
+          <w:iCs/>
+        </w:rPr>
+        <w:t xml:space="preserve">, School of Engineering, Ajeenkya D Y Patil University, Pune  </w:t>
+      </w:r>
+    </w:p>
+    <w:p>
+      <w:pPr>
+        <w:ind w:left="243" w:right="243"/>
+        <w:jc w:val="center"/>
+        <w:rPr>
+          <w:i/>
+          <w:iCs/>
+        </w:rPr>
+      </w:pPr>
+      <w:r>
+        <w:rPr>
+          <w:i/>
+          <w:iCs/>
+        </w:rPr>
+        <w:t>Assistant Professor</w:t>
+      </w:r>
+      <w:r>
+        <w:rPr>
+          <w:i/>
+          <w:iCs/>
+          <w:vertAlign w:val="superscript"/>
+        </w:rPr>
+        <w:t>4</w:t>
+      </w:r>
+      <w:r>
+        <w:rPr>
+          <w:i/>
+          <w:iCs/>
+        </w:rPr>
+        <w:t>, School of Engineering, Ajeenkya D Y Patil University, Pune</w:t>
+      </w:r>
+    </w:p>
+    <w:p>
+      <w:pPr>
+        <w:ind w:left="243" w:right="243"/>
+        <w:jc w:val="center"/>
+        <w:rPr>
+          <w:i/>
+          <w:iCs/>
+        </w:rPr>
+      </w:pPr>
+    </w:p>
+    <w:p>
+      <w:pPr>
+        <w:ind w:left="243" w:right="243"/>
+        <w:jc w:val="center"/>
+        <w:rPr>
+          <w:sz w:val="24"/>
+          <w:szCs w:val="24"/>
+          <w:vertAlign w:val="superscript"/>
+        </w:rPr>
+      </w:pPr>
+      <w:r>
+        <w:t xml:space="preserve">Correspondence Author- </w:t>
+      </w:r>
+      <w:hyperlink r:id="rId7" w:history="1">
+        <w:r>
+          <w:rPr>
+            <w:rStyle w:val="Hyperlink"/>
+          </w:rPr>
+          <w:t>priyanshu17ks@gmail.com</w:t>
+        </w:r>
+      </w:hyperlink>
     </w:p>
     <w:p>
       <w:pPr>
@@ -310,19 +477,25 @@
         <w:rPr>
           <w:color w:val="000000"/>
         </w:rPr>
-        <w:t xml:space="preserve">Cloud computing has matured from an infrastructure alternative into a primary execution environment for application delivery, data processing, and digital service integration. In practice, however, operational workflows remain fragmented </w:t>
-      </w:r>
-      <w:r>
-        <w:rPr>
-          <w:color w:val="000000"/>
-        </w:rPr>
-        <w:t>t</w:t>
-      </w:r>
-      <w:r>
-        <w:rPr>
-          <w:color w:val="000000"/>
-        </w:rPr>
-        <w:t xml:space="preserve">eams still switch between service-specific consoles, one-off scripts, and partially automated pipelines to complete routine cloud tasks. In Amazon Web Services (AWS) environments, this fragmentation appears in recurring activities such as provisioning EC2 instances, validating S3 configuration, checking VPC network state, and reconciling cost reports. The result is not only slower operations but also weaker governance visibility and reduced repeatability across environments </w:t>
+        <w:t>Cloud computing has come out of infrastructure option to become one of the main implementation platforms of application delivery, data processing, and integration of digital services. In reality though, operational processes continue to be disjointed teams still alternate between service-specific consoles, one off scripts, and semi-automated pipelines to accomplish mundane cloud tasks. This fragmentation is manifested in repeatable operations in Amazon Web Services (AWS) settings, including provisioning EC2 instances, checking the S3 configuration, checking the VPC network state, and cost reporting reconciliation</w:t>
+      </w:r>
+      <w:r>
+        <w:rPr>
+          <w:color w:val="000000"/>
+        </w:rPr>
+        <w:t>.</w:t>
+      </w:r>
+      <w:r>
+        <w:rPr>
+          <w:color w:val="000000"/>
+        </w:rPr>
+        <w:t xml:space="preserve"> </w:t>
+      </w:r>
+      <w:r>
+        <w:rPr>
+          <w:color w:val="000000"/>
+        </w:rPr>
+        <w:t xml:space="preserve">The result is not only slower operations but also weaker governance visibility and reduced repeatability across environments </w:t>
       </w:r>
       <w:hyperlink w:anchor="_heading=h.m8sji24l8fj4">
         <w:r>
@@ -403,7 +576,25 @@
         <w:rPr>
           <w:color w:val="000000"/>
         </w:rPr>
-        <w:t>The broad discussion around cloud lock-in is often positioned as a strategic issue. At implementation level, the immediate pain point is operational inconsistency. Different AWS services expose different control surfaces, parameter models, and operational semantics. As teams scale, the same logical action (for example, “prepare a deployment- ready environment”) may be executed through multiple toolchains depending on who performs it and which service is involved.</w:t>
+        <w:t>The general debate on cloud lock-in forms a strategic matter</w:t>
+      </w:r>
+      <w:r>
+        <w:rPr>
+          <w:color w:val="000000"/>
+        </w:rPr>
+        <w:t xml:space="preserve">. At implementation level, the immediate pain point is operational inconsistency. Different AWS services expose different control surfaces, parameter models, and operational semantics. </w:t>
+      </w:r>
+      <w:r>
+        <w:rPr>
+          <w:color w:val="000000"/>
+        </w:rPr>
+        <w:t>When teams grow, the same logical action (e.g., prepare a deployment- ready environment) can be implemented using many toolchains based on its implementation by who and which service</w:t>
+      </w:r>
+      <w:r>
+        <w:rPr>
+          <w:color w:val="000000"/>
+        </w:rPr>
+        <w:t>.</w:t>
       </w:r>
       <w:r>
         <w:rPr>
@@ -537,49 +728,20 @@
         <w:rPr>
           <w:color w:val="000000"/>
         </w:rPr>
-        <w:t xml:space="preserve">Prior work already links these conditions to slower platform delivery and higher drift probability </w:t>
-      </w:r>
-      <w:hyperlink w:anchor="_heading=h.93o68whk52rm">
-        <w:r>
-          <w:rPr>
-            <w:color w:val="000000"/>
-          </w:rPr>
-          <w:t>[1],</w:t>
-        </w:r>
-      </w:hyperlink>
-      <w:r>
-        <w:rPr>
-          <w:color w:val="000000"/>
-        </w:rPr>
-        <w:t xml:space="preserve"> </w:t>
-      </w:r>
-      <w:hyperlink w:anchor="_heading=h.hzrkl3v6dsv1">
-        <w:r>
-          <w:rPr>
-            <w:color w:val="000000"/>
-          </w:rPr>
-          <w:t>[5].</w:t>
-        </w:r>
-      </w:hyperlink>
-      <w:r>
-        <w:rPr>
-          <w:color w:val="000000"/>
-        </w:rPr>
-        <w:t xml:space="preserve"> For academic and industrial relevance, the key requirement is therefore not only ”more automation,” but </w:t>
-      </w:r>
-      <w:r>
-        <w:rPr>
-          <w:i/>
-          <w:iCs/>
-          <w:color w:val="000000"/>
-        </w:rPr>
-        <w:t xml:space="preserve">standardized automation </w:t>
-      </w:r>
-      <w:r>
-        <w:rPr>
-          <w:color w:val="000000"/>
-        </w:rPr>
-        <w:t>with traceable control points.</w:t>
+        <w:t xml:space="preserve">Pre-existing literature already associates these conditions with increased platform delivery time and increased drift </w:t>
+      </w:r>
+      <w:r>
+        <w:rPr>
+          <w:color w:val="000000"/>
+        </w:rPr>
+        <w:lastRenderedPageBreak/>
+        <w:t>probability [1], [5]. To be academically and industry relevant, however the most critical thing is not simply more automation but standardized automation that has traceable points of control</w:t>
+      </w:r>
+      <w:r>
+        <w:rPr>
+          <w:color w:val="000000"/>
+        </w:rPr>
+        <w:t>.</w:t>
       </w:r>
     </w:p>
     <w:p>
@@ -638,14 +800,13 @@
         <w:rPr>
           <w:color w:val="000000"/>
         </w:rPr>
-        <w:t xml:space="preserve">This study focuses exclusively on Amazon Web Services (AWS) because the current production-ready </w:t>
-      </w:r>
-      <w:r>
-        <w:rPr>
-          <w:color w:val="000000"/>
-        </w:rPr>
-        <w:lastRenderedPageBreak/>
-        <w:t>implementation of Nebula is AWS-native. Rather than presenting a broad but only partially validated multi-cloud claim, this paper adopts a depth-first strategy: validating a single provider with empirical data to establish a rigorous baseline for future cross-platform extensions.</w:t>
+        <w:t>This paper will solely concentrate on Amazon Web Services (AWS) since the existing production-ready version of Nebula is AWS-native. Instead of making a grand yet still half-proven multi-cloud claim, this paper will take a depth-first approach: to prove one provider empirically and create a rigorous foundation of future cross-platform extensions</w:t>
+      </w:r>
+      <w:r>
+        <w:rPr>
+          <w:color w:val="000000"/>
+        </w:rPr>
+        <w:t>.</w:t>
       </w:r>
     </w:p>
     <w:p>
@@ -795,7 +956,7 @@
         <w:rPr>
           <w:color w:val="000000"/>
         </w:rPr>
-        <w:t>The core motivation is practical: if a unified orchestration model can reduce operational friction within a single provider domain while retaining security and responsiveness, then the same pattern can be generalized with lower risk.</w:t>
+        <w:t>The essence of the motivation is practical, should a unified orchestration model be able to decrease operational friction in a single provider domain without compromises in security and responsiveness the same trend can be extended with reduced risk.</w:t>
       </w:r>
     </w:p>
     <w:p>
@@ -842,210 +1003,6 @@
           <w:right w:val="nil"/>
           <w:between w:val="nil"/>
         </w:pBdr>
-        <w:spacing w:before="83" w:line="252" w:lineRule="auto"/>
-        <w:ind w:left="259" w:firstLine="219"/>
-        <w:rPr>
-          <w:color w:val="000000"/>
-        </w:rPr>
-      </w:pPr>
-      <w:r>
-        <w:rPr>
-          <w:color w:val="000000"/>
-        </w:rPr>
-        <w:t>Nebula applies a layered architecture that separates interaction logic from execution logic and persistence logi</w:t>
-      </w:r>
-      <w:r>
-        <w:rPr>
-          <w:color w:val="000000"/>
-        </w:rPr>
-        <w:t xml:space="preserve">c. </w:t>
-      </w:r>
-      <w:r>
-        <w:rPr>
-          <w:color w:val="000000"/>
-        </w:rPr>
-        <w:t>The architecture is summarized through five cooperating layers:</w:t>
-      </w:r>
-    </w:p>
-    <w:p>
-      <w:pPr>
-        <w:numPr>
-          <w:ilvl w:val="1"/>
-          <w:numId w:val="10"/>
-        </w:numPr>
-        <w:pBdr>
-          <w:top w:val="nil"/>
-          <w:left w:val="nil"/>
-          <w:bottom w:val="nil"/>
-          <w:right w:val="nil"/>
-          <w:between w:val="nil"/>
-        </w:pBdr>
-        <w:tabs>
-          <w:tab w:val="left" w:pos="694"/>
-        </w:tabs>
-        <w:spacing w:before="42" w:line="252" w:lineRule="auto"/>
-        <w:ind w:right="257"/>
-      </w:pPr>
-      <w:r>
-        <w:rPr>
-          <w:b/>
-          <w:bCs/>
-          <w:color w:val="000000"/>
-        </w:rPr>
-        <w:t>Presentation Layer (React + Vite)</w:t>
-      </w:r>
-      <w:r>
-        <w:rPr>
-          <w:color w:val="000000"/>
-        </w:rPr>
-        <w:t>: presents unified user workflows for credentials, provisioning, dashboard analytics, and deployment tracking.</w:t>
-      </w:r>
-    </w:p>
-    <w:p>
-      <w:pPr>
-        <w:numPr>
-          <w:ilvl w:val="1"/>
-          <w:numId w:val="10"/>
-        </w:numPr>
-        <w:pBdr>
-          <w:top w:val="nil"/>
-          <w:left w:val="nil"/>
-          <w:bottom w:val="nil"/>
-          <w:right w:val="nil"/>
-          <w:between w:val="nil"/>
-        </w:pBdr>
-        <w:tabs>
-          <w:tab w:val="left" w:pos="694"/>
-        </w:tabs>
-        <w:spacing w:before="2" w:line="252" w:lineRule="auto"/>
-        <w:ind w:right="257"/>
-      </w:pPr>
-      <w:r>
-        <w:rPr>
-          <w:b/>
-          <w:bCs/>
-          <w:color w:val="000000"/>
-        </w:rPr>
-        <w:t>Application API Layer (FastAPI)</w:t>
-      </w:r>
-      <w:r>
-        <w:rPr>
-          <w:color w:val="000000"/>
-        </w:rPr>
-        <w:t>: validates requests, enforces authentication and authorization boundaries, and exposes orchestration endpoints.</w:t>
-      </w:r>
-    </w:p>
-    <w:p>
-      <w:pPr>
-        <w:numPr>
-          <w:ilvl w:val="1"/>
-          <w:numId w:val="10"/>
-        </w:numPr>
-        <w:pBdr>
-          <w:top w:val="nil"/>
-          <w:left w:val="nil"/>
-          <w:bottom w:val="nil"/>
-          <w:right w:val="nil"/>
-          <w:between w:val="nil"/>
-        </w:pBdr>
-        <w:tabs>
-          <w:tab w:val="left" w:pos="694"/>
-        </w:tabs>
-        <w:spacing w:before="2" w:line="252" w:lineRule="auto"/>
-        <w:ind w:right="257"/>
-      </w:pPr>
-      <w:r>
-        <w:rPr>
-          <w:b/>
-          <w:bCs/>
-          <w:color w:val="000000"/>
-        </w:rPr>
-        <w:t>Asynchronous Control Layer (Celery + Redis)</w:t>
-      </w:r>
-      <w:r>
-        <w:rPr>
-          <w:color w:val="000000"/>
-        </w:rPr>
-        <w:t>: queues long-running tasks so front-end interactions are not blocked by infrastructure runtime.</w:t>
-      </w:r>
-    </w:p>
-    <w:p>
-      <w:pPr>
-        <w:numPr>
-          <w:ilvl w:val="1"/>
-          <w:numId w:val="10"/>
-        </w:numPr>
-        <w:pBdr>
-          <w:top w:val="nil"/>
-          <w:left w:val="nil"/>
-          <w:bottom w:val="nil"/>
-          <w:right w:val="nil"/>
-          <w:between w:val="nil"/>
-        </w:pBdr>
-        <w:tabs>
-          <w:tab w:val="left" w:pos="694"/>
-        </w:tabs>
-        <w:spacing w:before="2" w:line="252" w:lineRule="auto"/>
-        <w:ind w:right="257"/>
-      </w:pPr>
-      <w:r>
-        <w:rPr>
-          <w:b/>
-          <w:bCs/>
-          <w:color w:val="000000"/>
-        </w:rPr>
-        <w:t>Provisioning Layer (Terraform + AWS modules)</w:t>
-      </w:r>
-      <w:r>
-        <w:rPr>
-          <w:color w:val="000000"/>
-        </w:rPr>
-        <w:t>: executes deterministic infrastructure state transitions using declarative plans.</w:t>
-      </w:r>
-    </w:p>
-    <w:p>
-      <w:pPr>
-        <w:numPr>
-          <w:ilvl w:val="1"/>
-          <w:numId w:val="10"/>
-        </w:numPr>
-        <w:pBdr>
-          <w:top w:val="nil"/>
-          <w:left w:val="nil"/>
-          <w:bottom w:val="nil"/>
-          <w:right w:val="nil"/>
-          <w:between w:val="nil"/>
-        </w:pBdr>
-        <w:tabs>
-          <w:tab w:val="left" w:pos="694"/>
-        </w:tabs>
-        <w:spacing w:before="2" w:line="252" w:lineRule="auto"/>
-        <w:ind w:right="257"/>
-      </w:pPr>
-      <w:r>
-        <w:rPr>
-          <w:b/>
-          <w:bCs/>
-          <w:color w:val="000000"/>
-        </w:rPr>
-        <w:t>Data and Audit Layer (PostgreSQL)</w:t>
-      </w:r>
-      <w:r>
-        <w:rPr>
-          <w:color w:val="000000"/>
-        </w:rPr>
-        <w:t>: stores user context, encrypted credentials metadata, inventory snapshots, health records, and cost artifacts.</w:t>
-      </w:r>
-    </w:p>
-    <w:p>
-      <w:pPr>
-        <w:pBdr>
-          <w:top w:val="nil"/>
-          <w:left w:val="nil"/>
-          <w:bottom w:val="nil"/>
-          <w:right w:val="nil"/>
-          <w:between w:val="nil"/>
-        </w:pBdr>
         <w:spacing w:before="42" w:line="252" w:lineRule="auto"/>
         <w:ind w:left="259" w:right="257" w:firstLine="219"/>
         <w:jc w:val="both"/>
@@ -1057,7 +1014,140 @@
         <w:rPr>
           <w:color w:val="000000"/>
         </w:rPr>
-        <w:t>This decomposition improves maintainability because each layer can evolve independently while preserving a stable interface contract. It also improves reliability: failures in provisioning tasks can be isolated from API responsiveness.</w:t>
+        <w:t xml:space="preserve">Nebula uses a layered architecture, which isolates interaction logic, execution logic, and persistence logic. The architecture can be summarized by having five co-operating layers: </w:t>
+      </w:r>
+    </w:p>
+    <w:p>
+      <w:pPr>
+        <w:pBdr>
+          <w:top w:val="nil"/>
+          <w:left w:val="nil"/>
+          <w:bottom w:val="nil"/>
+          <w:right w:val="nil"/>
+          <w:between w:val="nil"/>
+        </w:pBdr>
+        <w:spacing w:before="42" w:line="252" w:lineRule="auto"/>
+        <w:ind w:left="259" w:right="257" w:firstLine="219"/>
+        <w:jc w:val="both"/>
+        <w:rPr>
+          <w:color w:val="000000"/>
+        </w:rPr>
+      </w:pPr>
+      <w:r>
+        <w:rPr>
+          <w:color w:val="000000"/>
+        </w:rPr>
+        <w:t>• Presentation Layer (React + Vite): displays cohesive user workflows of credentials, provisioning, dashboard analytics and deployment tracking.</w:t>
+      </w:r>
+    </w:p>
+    <w:p>
+      <w:pPr>
+        <w:pBdr>
+          <w:top w:val="nil"/>
+          <w:left w:val="nil"/>
+          <w:bottom w:val="nil"/>
+          <w:right w:val="nil"/>
+          <w:between w:val="nil"/>
+        </w:pBdr>
+        <w:spacing w:before="42" w:line="252" w:lineRule="auto"/>
+        <w:ind w:left="259" w:right="257" w:firstLine="219"/>
+        <w:jc w:val="both"/>
+        <w:rPr>
+          <w:color w:val="000000"/>
+        </w:rPr>
+      </w:pPr>
+      <w:r>
+        <w:rPr>
+          <w:color w:val="000000"/>
+        </w:rPr>
+        <w:t xml:space="preserve"> • Application API Layer (FastAPI): validates requests, implements authentication and authorization limits, and reveals orchestration endpoints. </w:t>
+      </w:r>
+    </w:p>
+    <w:p>
+      <w:pPr>
+        <w:pBdr>
+          <w:top w:val="nil"/>
+          <w:left w:val="nil"/>
+          <w:bottom w:val="nil"/>
+          <w:right w:val="nil"/>
+          <w:between w:val="nil"/>
+        </w:pBdr>
+        <w:spacing w:before="42" w:line="252" w:lineRule="auto"/>
+        <w:ind w:left="259" w:right="257" w:firstLine="219"/>
+        <w:jc w:val="both"/>
+        <w:rPr>
+          <w:color w:val="000000"/>
+        </w:rPr>
+      </w:pPr>
+      <w:r>
+        <w:rPr>
+          <w:color w:val="000000"/>
+        </w:rPr>
+        <w:t xml:space="preserve">• Asynchronous Control Layer (Celery + Redis): enlists long-running tasks to avoid blocking front-end interactions by infrastructure runtime. </w:t>
+      </w:r>
+    </w:p>
+    <w:p>
+      <w:pPr>
+        <w:pBdr>
+          <w:top w:val="nil"/>
+          <w:left w:val="nil"/>
+          <w:bottom w:val="nil"/>
+          <w:right w:val="nil"/>
+          <w:between w:val="nil"/>
+        </w:pBdr>
+        <w:spacing w:before="42" w:line="252" w:lineRule="auto"/>
+        <w:ind w:left="259" w:right="257" w:firstLine="219"/>
+        <w:jc w:val="both"/>
+        <w:rPr>
+          <w:color w:val="000000"/>
+        </w:rPr>
+      </w:pPr>
+      <w:r>
+        <w:rPr>
+          <w:color w:val="000000"/>
+        </w:rPr>
+        <w:t xml:space="preserve">• Provisioning Layer (Terraform + AWS modules): performs deterministic state transitions in infrastructure based on declarative plans. </w:t>
+      </w:r>
+    </w:p>
+    <w:p>
+      <w:pPr>
+        <w:pBdr>
+          <w:top w:val="nil"/>
+          <w:left w:val="nil"/>
+          <w:bottom w:val="nil"/>
+          <w:right w:val="nil"/>
+          <w:between w:val="nil"/>
+        </w:pBdr>
+        <w:spacing w:before="42" w:line="252" w:lineRule="auto"/>
+        <w:ind w:left="259" w:right="257" w:firstLine="219"/>
+        <w:jc w:val="both"/>
+        <w:rPr>
+          <w:color w:val="000000"/>
+        </w:rPr>
+      </w:pPr>
+      <w:r>
+        <w:rPr>
+          <w:color w:val="000000"/>
+        </w:rPr>
+        <w:t>•</w:t>
+      </w:r>
+      <w:r>
+        <w:rPr>
+          <w:color w:val="000000"/>
+        </w:rPr>
+        <w:t xml:space="preserve"> </w:t>
+      </w:r>
+      <w:r>
+        <w:rPr>
+          <w:color w:val="000000"/>
+        </w:rPr>
+        <w:t>Data and Audit Layer (PostgreSQL): contains user context, encrypted credentials metadata, inventory snapshots, health records, and cost artifacts. This layering enhances maintainability since every layer has the ability to develop independently, and maintains a stable interface contract. It also enhances reliability: API responsiveness can be decoupled with failings in provisioning tasks</w:t>
+      </w:r>
+      <w:r>
+        <w:rPr>
+          <w:color w:val="000000"/>
+        </w:rPr>
+        <w:t>.</w:t>
       </w:r>
     </w:p>
     <w:p>
@@ -1118,7 +1208,25 @@
         <w:rPr>
           <w:color w:val="000000"/>
         </w:rPr>
-        <w:t>The remaining sections are organized as follows. Section II reviews literature on IaC, lock-in, and standardization frameworks. Section III explains strategic value and operational standardization outcomes. Section IV details feature abstractions and AI-oriented extensions. Section V documents implementation architecture, technology stack rationale, and workflow traceability. Section VI presents performance evidence with real project values. Section VII covers deployment scope and future risk-management directions. Section VIII concludes with findings, limitations, and expansion pathway.</w:t>
+        <w:t xml:space="preserve">The </w:t>
+      </w:r>
+      <w:r>
+        <w:rPr>
+          <w:color w:val="000000"/>
+        </w:rPr>
+        <w:t>other</w:t>
+      </w:r>
+      <w:r>
+        <w:rPr>
+          <w:color w:val="000000"/>
+        </w:rPr>
+        <w:t xml:space="preserve"> sections are organized as follows. Section II reviews literature on IaC, lock-in, and standardization frameworks. Section III explains strategic value and operational standardization outcomes. Section IV details feature abstractions and AI-oriented extensions. Section V documents implementation architecture, technology stack rationale, and workflow traceability. </w:t>
+      </w:r>
+      <w:r>
+        <w:rPr>
+          <w:color w:val="000000"/>
+        </w:rPr>
+        <w:t>Section VI shows performance evidence using actual project values. Section VII deals with scope of deployment and future directions of risk-management. Section VIII ends with conclusions, limitations and future development.</w:t>
       </w:r>
     </w:p>
     <w:p>
@@ -1170,35 +1278,7 @@
         <w:rPr>
           <w:color w:val="000000"/>
         </w:rPr>
-        <w:t xml:space="preserve">The literature on cloud operations repeatedly converges on a shared conclusion: the technical ability to provision infrastructure is no longer the primary bottleneck; operational coordination and governance consistency are </w:t>
-      </w:r>
-      <w:hyperlink w:anchor="_heading=h.93o68whk52rm">
-        <w:r>
-          <w:rPr>
-            <w:color w:val="000000"/>
-          </w:rPr>
-          <w:t>[1],</w:t>
-        </w:r>
-      </w:hyperlink>
-      <w:r>
-        <w:rPr>
-          <w:color w:val="000000"/>
-        </w:rPr>
-        <w:t xml:space="preserve"> </w:t>
-      </w:r>
-      <w:hyperlink w:anchor="_heading=h.ovrshcu8zn3y">
-        <w:r>
-          <w:rPr>
-            <w:color w:val="000000"/>
-          </w:rPr>
-          <w:t>[6].</w:t>
-        </w:r>
-      </w:hyperlink>
-      <w:r>
-        <w:rPr>
-          <w:color w:val="000000"/>
-        </w:rPr>
-        <w:t xml:space="preserve"> This section synthesizes findings most relevant to an AWS-first orchestration implementation.</w:t>
+        <w:t>The cloud operations literature is striking an over and over again common denominator: the technical capability to supply infrastructure is no longer the key bottleneck; the coordination of operations and consistent governance are [1], [6]. The section summarizes the findings that are most pertinent to an AWS-first orchestration implementation.</w:t>
       </w:r>
     </w:p>
     <w:p>
@@ -1269,41 +1349,19 @@
         <w:rPr>
           <w:color w:val="000000"/>
         </w:rPr>
-        <w:t xml:space="preserve"> This framing introduces software-like controls to infrastructure delivery: repeatability, reviewability, and predictable rollback patterns. Terraform has become one of the dominant IaC tools because it provides declarative configuration, dependency-aware planning, and broad provider integration through a unified execution model </w:t>
-      </w:r>
-      <w:hyperlink w:anchor="_heading=h.22cr1jz84h0f">
-        <w:r>
-          <w:rPr>
-            <w:color w:val="000000"/>
-          </w:rPr>
-          <w:t>[7],</w:t>
-        </w:r>
-      </w:hyperlink>
-      <w:r>
-        <w:rPr>
-          <w:color w:val="000000"/>
-        </w:rPr>
-        <w:t xml:space="preserve"> </w:t>
-      </w:r>
-      <w:hyperlink w:anchor="_heading=h.s3m4cwls3uen">
-        <w:r>
-          <w:rPr>
-            <w:color w:val="000000"/>
-          </w:rPr>
-          <w:t>[8].</w:t>
-        </w:r>
-      </w:hyperlink>
-      <w:r>
-        <w:rPr>
-          <w:color w:val="000000"/>
-        </w:rPr>
-        <w:t xml:space="preserve"> </w:t>
-      </w:r>
-      <w:r>
-        <w:rPr>
-          <w:color w:val="000000"/>
-        </w:rPr>
-        <w:t>For this work, the significance of IaC is twofold. First, it creates a stable contract between user intent and runtime execution. Second, it allows orchestration logic to reason about lifecycle phases (</w:t>
+        <w:t xml:space="preserve"> This framing introduces software-like controls to infrastructure delivery: repeatability, reviewability, and predictable rollback patterns. </w:t>
+      </w:r>
+      <w:r>
+        <w:rPr>
+          <w:color w:val="000000"/>
+        </w:rPr>
+        <w:t>Terraform is now among the most popular IaC tools, as it offers declarative configuration, dependency-based planning, and generality, i.e. wide provider integration, using a common execution model [7], [8]. In this work, the importance of IaC is two-fold</w:t>
+      </w:r>
+      <w:r>
+        <w:rPr>
+          <w:color w:val="000000"/>
+        </w:rPr>
+        <w:t>. First, it creates a stable contract between user intent and runtime execution. Second, it allows orchestration logic to reason about lifecycle phases (</w:t>
       </w:r>
       <w:r>
         <w:rPr>
@@ -1401,42 +1459,20 @@
         <w:rPr>
           <w:color w:val="000000"/>
         </w:rPr>
-        <w:t xml:space="preserve">Lock-in is often reduced to proprietary APIs, but studies show that lock-in has at least four dimensions: technical dependencies, operational habits, financial coupling, and strategic planning inertia </w:t>
-      </w:r>
-      <w:hyperlink w:anchor="_heading=h.93o68whk52rm">
-        <w:r>
-          <w:rPr>
-            <w:color w:val="000000"/>
-          </w:rPr>
-          <w:t>[1],</w:t>
-        </w:r>
-      </w:hyperlink>
+        <w:lastRenderedPageBreak/>
+        <w:t>Lock-in is frequently narrowed down to proprietary APIs, yet research indicates that lock-in has at least four dimensions: technical dependencies, operational habits, financial coupling, and strategic planning inertia [1], [9].</w:t>
+      </w:r>
       <w:r>
         <w:rPr>
           <w:color w:val="000000"/>
         </w:rPr>
         <w:t xml:space="preserve"> </w:t>
       </w:r>
-      <w:hyperlink w:anchor="_heading=h.tae7l93nslfo">
-        <w:r>
-          <w:rPr>
-            <w:color w:val="000000"/>
-          </w:rPr>
-          <w:t>[9].</w:t>
-        </w:r>
-      </w:hyperlink>
-      <w:r>
-        <w:rPr>
-          <w:color w:val="000000"/>
-        </w:rPr>
-        <w:t xml:space="preserve"> Even when migration paths exist, organizations delay transition because internal processes and team workflows are optimized around a single </w:t>
-      </w:r>
-      <w:r>
-        <w:rPr>
-          <w:color w:val="000000"/>
-        </w:rPr>
-        <w:lastRenderedPageBreak/>
-        <w:t>vendor’s control model.</w:t>
+      <w:r>
+        <w:rPr>
+          <w:color w:val="000000"/>
+        </w:rPr>
+        <w:t>Organizations postpone migration even in the face of migration paths due to internal processes and team processes being optimized around one vendor control model. This is a subtlety that is significant in the current research.</w:t>
       </w:r>
       <w:r>
         <w:rPr>
@@ -1507,89 +1543,13 @@
         <w:rPr>
           <w:color w:val="000000"/>
         </w:rPr>
-        <w:t xml:space="preserve">NIST and ISO/IEC guidance emphasizes consistency in service definitions, management interfaces, and </w:t>
-      </w:r>
-      <w:r>
-        <w:t>governance</w:t>
-      </w:r>
-      <w:r>
-        <w:rPr>
-          <w:color w:val="000000"/>
-        </w:rPr>
-        <w:t xml:space="preserve"> controls as prerequisites for robust cloud operations </w:t>
-      </w:r>
-      <w:hyperlink w:anchor="_heading=h.93o68whk52rm">
-        <w:r>
-          <w:rPr>
-            <w:color w:val="000000"/>
-          </w:rPr>
-          <w:t>[2],</w:t>
-        </w:r>
-      </w:hyperlink>
-      <w:r>
-        <w:rPr>
-          <w:color w:val="000000"/>
-        </w:rPr>
-        <w:t xml:space="preserve"> </w:t>
-      </w:r>
-      <w:hyperlink w:anchor="_heading=h.rqrjnuf6t0qz">
-        <w:r>
-          <w:rPr>
-            <w:color w:val="000000"/>
-          </w:rPr>
-          <w:t>[10],</w:t>
-        </w:r>
-      </w:hyperlink>
-      <w:r>
-        <w:rPr>
-          <w:color w:val="000000"/>
-        </w:rPr>
-        <w:t xml:space="preserve"> </w:t>
-      </w:r>
-      <w:hyperlink w:anchor="_heading=h.s3m7wbhzs775">
-        <w:r>
-          <w:rPr>
-            <w:color w:val="000000"/>
-          </w:rPr>
-          <w:t>[11].</w:t>
-        </w:r>
-      </w:hyperlink>
-      <w:r>
-        <w:rPr>
-          <w:color w:val="000000"/>
-        </w:rPr>
-        <w:t xml:space="preserve"> Complementary frameworks such as TOSCA and OCCI extend this conversation to portability and interoperable service representation </w:t>
-      </w:r>
-      <w:hyperlink w:anchor="_heading=h.jl69zv5gkgqj">
-        <w:r>
-          <w:rPr>
-            <w:color w:val="000000"/>
-          </w:rPr>
-          <w:t>[12],</w:t>
-        </w:r>
-      </w:hyperlink>
-      <w:r>
-        <w:rPr>
-          <w:color w:val="000000"/>
-        </w:rPr>
-        <w:t xml:space="preserve"> </w:t>
-      </w:r>
-      <w:hyperlink w:anchor="_heading=h.dcndrt3syw78">
-        <w:r>
-          <w:rPr>
-            <w:color w:val="000000"/>
-          </w:rPr>
-          <w:t>[13].</w:t>
-        </w:r>
-      </w:hyperlink>
-      <w:r>
-        <w:t xml:space="preserve"> </w:t>
-      </w:r>
-      <w:r>
-        <w:rPr>
-          <w:color w:val="000000"/>
-        </w:rPr>
-        <w:t>These references do not prescribe one implementation stack, but they collectively support a key engineering principle: control plane standardization should be explicit, not incidental. Nebula aligns with this principle by centralizing authentication, resource state transitions, and telemetry access behind a single API surface.</w:t>
+        <w:t>The guidance offered by NIST and ISO/IEC focuses on consistency of service definitions, management interfaces, and governance controls as preconditions of effective cloud operations [2], [10], [11]. This discussion is further extended to portability and interoperable service representation by complementary frameworks like TOSCA and OCCI [12], [13]. These references do not mandate a single implementation stack, although they all complement one major principle of key engineering: control plane standardization must be explicit, not incidental. Nebula is compatible with this concept by making authentication, changes in resource state, and telemetry access behind one API surface</w:t>
+      </w:r>
+      <w:r>
+        <w:rPr>
+          <w:color w:val="000000"/>
+        </w:rPr>
+        <w:t>.</w:t>
       </w:r>
     </w:p>
     <w:p>
@@ -1646,72 +1606,13 @@
         <w:rPr>
           <w:color w:val="000000"/>
         </w:rPr>
-        <w:t xml:space="preserve">Prior benchmarking work indicates that orchestration overhead is generally lower than provider-side resource creation time, especially when long-running tasks are decoupled from synchronous request handling </w:t>
-      </w:r>
-      <w:hyperlink w:anchor="_heading=h.b6agejok2tkt">
-        <w:r>
-          <w:rPr>
-            <w:color w:val="000000"/>
-          </w:rPr>
-          <w:t>[14],</w:t>
-        </w:r>
-      </w:hyperlink>
-      <w:r>
-        <w:rPr>
-          <w:color w:val="000000"/>
-        </w:rPr>
-        <w:t xml:space="preserve"> </w:t>
-      </w:r>
-      <w:hyperlink w:anchor="_heading=h.y26d5k8c08o8">
-        <w:r>
-          <w:rPr>
-            <w:color w:val="000000"/>
-          </w:rPr>
-          <w:t>[15].</w:t>
-        </w:r>
-      </w:hyperlink>
-      <w:r>
-        <w:rPr>
-          <w:color w:val="000000"/>
-        </w:rPr>
-        <w:t xml:space="preserve"> This supports a design where API endpoints acknowledge quickly while background workers execute provisioning and synchronization routines.</w:t>
-      </w:r>
-    </w:p>
-    <w:p>
-      <w:pPr>
-        <w:pBdr>
-          <w:top w:val="nil"/>
-          <w:left w:val="nil"/>
-          <w:bottom w:val="nil"/>
-          <w:right w:val="nil"/>
-          <w:between w:val="nil"/>
-        </w:pBdr>
-        <w:spacing w:before="4" w:line="252" w:lineRule="auto"/>
-        <w:ind w:left="259" w:right="257" w:firstLine="219"/>
-        <w:jc w:val="both"/>
-        <w:rPr>
-          <w:color w:val="000000"/>
-        </w:rPr>
-      </w:pPr>
-      <w:r>
-        <w:rPr>
-          <w:color w:val="000000"/>
-        </w:rPr>
-        <w:t xml:space="preserve">The literature also reports that asynchronous patterns improve failure handling and throughput under concurrency, provided that queue semantics and task observability are well designed </w:t>
-      </w:r>
-      <w:hyperlink w:anchor="_heading=h.g2l9x7dw94pk">
-        <w:r>
-          <w:rPr>
-            <w:color w:val="000000"/>
-          </w:rPr>
-          <w:t>[16].</w:t>
-        </w:r>
-      </w:hyperlink>
-      <w:r>
-        <w:rPr>
-          <w:color w:val="000000"/>
-        </w:rPr>
-        <w:t xml:space="preserve"> These findings are directly reflected in our architecture choices for Redis-backed task routing and worker-driven Terraform execution.</w:t>
+        <w:t>According to prior benchmarking efforts, orchestration overhead typically remains smaller than the time to create resources on the provider side, particularly in the case of long-running tasks decoupled to synchronous request processing [14], [15]. This promotes a architecture in which API endpoints respond with quick recognition and background tasks do provisioning and synchronization tasks. It is also mentioned in the literature that the asynchronous patterns enhance failure management and throughput during concurrency, when queue semantics and task observability are properly implemented [16]. These observations can be directly seen in our architecture decisions of Redis-backed task routing and worker-driven Terraform execution.E. Cost Visibility and Governance Analytics</w:t>
+      </w:r>
+      <w:r>
+        <w:rPr>
+          <w:color w:val="000000"/>
+        </w:rPr>
+        <w:t>.</w:t>
       </w:r>
     </w:p>
     <w:p>
@@ -1759,57 +1660,6 @@
           <w:right w:val="nil"/>
           <w:between w:val="nil"/>
         </w:pBdr>
-        <w:spacing w:before="82" w:line="252" w:lineRule="auto"/>
-        <w:ind w:left="259" w:right="257" w:firstLine="219"/>
-        <w:jc w:val="both"/>
-        <w:rPr>
-          <w:color w:val="000000"/>
-        </w:rPr>
-      </w:pPr>
-      <w:r>
-        <w:rPr>
-          <w:color w:val="000000"/>
-        </w:rPr>
-        <w:t xml:space="preserve">Industry reports continue to identify cost opacity as a recurring challenge in cloud programs </w:t>
-      </w:r>
-      <w:hyperlink w:anchor="_heading=h.tae7l93nslfo">
-        <w:r>
-          <w:rPr>
-            <w:color w:val="000000"/>
-          </w:rPr>
-          <w:t>[9],</w:t>
-        </w:r>
-      </w:hyperlink>
-      <w:r>
-        <w:rPr>
-          <w:color w:val="000000"/>
-        </w:rPr>
-        <w:t xml:space="preserve"> </w:t>
-      </w:r>
-      <w:hyperlink w:anchor="_heading=h.ua8satmn7nmq">
-        <w:r>
-          <w:rPr>
-            <w:color w:val="000000"/>
-          </w:rPr>
-          <w:t>[17].</w:t>
-        </w:r>
-      </w:hyperlink>
-      <w:r>
-        <w:rPr>
-          <w:color w:val="000000"/>
-        </w:rPr>
-        <w:t xml:space="preserve"> The challenge is not only forecasting; teams often lack operational linkage between resources and cost signals. Without a unified view, optimization decisions become delayed or ad hoc.</w:t>
-      </w:r>
-    </w:p>
-    <w:p>
-      <w:pPr>
-        <w:pBdr>
-          <w:top w:val="nil"/>
-          <w:left w:val="nil"/>
-          <w:bottom w:val="nil"/>
-          <w:right w:val="nil"/>
-          <w:between w:val="nil"/>
-        </w:pBdr>
         <w:spacing w:before="4" w:line="252" w:lineRule="auto"/>
         <w:ind w:left="259" w:right="257" w:firstLine="219"/>
         <w:jc w:val="both"/>
@@ -1821,7 +1671,7 @@
         <w:rPr>
           <w:color w:val="000000"/>
         </w:rPr>
-        <w:t>For this reason, Nebula integrates resource inventory and billing outputs into the same operational plane. The literature suggests this integration is central to practical governance maturity, especially in environments where finance and engineering decisions must be synchronized.</w:t>
+        <w:t>The available studies are very strategic, but implementation articles featuring open operational values are less frequent. Numerous papers philosophize about the patterns of architecture, but give minimal replicable observations of working systems. The present paper fills this gap by providing an AWS-first implementation, explicit metrics, workflow traces, and section-level constraints. It is not a goal of over-claiming that clouds are generally applicable, but to create a concrete base, which can be tested, criticized, and built upon.</w:t>
       </w:r>
     </w:p>
     <w:p>
@@ -1849,8 +1699,6 @@
           <w:color w:val="000000"/>
         </w:rPr>
       </w:pPr>
-      <w:bookmarkStart w:id="10" w:name="bookmark=id.rg28h2ie115u" w:colFirst="0" w:colLast="0"/>
-      <w:bookmarkEnd w:id="10"/>
       <w:r>
         <w:rPr>
           <w:i/>
@@ -1902,8 +1750,8 @@
         <w:spacing w:before="154"/>
         <w:ind w:left="4041" w:hanging="403"/>
       </w:pPr>
-      <w:bookmarkStart w:id="11" w:name="bookmark=id.9ubipqcihlq5" w:colFirst="0" w:colLast="0"/>
-      <w:bookmarkEnd w:id="11"/>
+      <w:bookmarkStart w:id="10" w:name="bookmark=id.9ubipqcihlq5" w:colFirst="0" w:colLast="0"/>
+      <w:bookmarkEnd w:id="10"/>
       <w:r>
         <w:rPr>
           <w:smallCaps/>
@@ -1932,7 +1780,7 @@
         <w:rPr>
           <w:color w:val="000000"/>
         </w:rPr>
-        <w:t>Nebula’s value proposition is centered on operational standardization, not only automation volume. The platform aims to convert fragmented AWS routines into a coherent lifecycle that can be executed, observed, and audited through one interface and one API contract.</w:t>
+        <w:t>The value proposal offered by Nebula is focused on the standardization of operations, rather than automation volume. The platform will be designed to transform disjointed AWS routines into an integrated lifecycle that can be implemented, monitored, and audited using a single interface and a single API contract.</w:t>
       </w:r>
     </w:p>
     <w:p>
@@ -1960,8 +1808,6 @@
           <w:color w:val="000000"/>
         </w:rPr>
       </w:pPr>
-      <w:bookmarkStart w:id="12" w:name="bookmark=id.rn01vyp6qzom" w:colFirst="0" w:colLast="0"/>
-      <w:bookmarkEnd w:id="12"/>
       <w:r>
         <w:rPr>
           <w:i/>
@@ -1991,7 +1837,7 @@
         <w:rPr>
           <w:color w:val="000000"/>
         </w:rPr>
-        <w:t>Teams often automate selected tasks (for example, provisioning scripts) while leaving adjacent tasks (health checks, cost reconciliation, and inventory refresh) manual. This partial automation model creates local speedups but preserves end-to-end inconsistency. Nebula addresses this by enforcing standardized states and synchronized data flows across provisioning, monitoring, and cost governance.</w:t>
+        <w:t>Teams can automate a subset of tasks (such as provisioning scripts) and still leave some neighboring tasks (health checks, cost reconciliation and inventory refresh) manual. The end-to-end consistency is maintained in this model of partial automation, which generates local speedups. Nebula also solves this by implementing standardized states and coordinated data flows through provisioning, monitoring and cost governance.B. AWS Operational Consolidation.</w:t>
       </w:r>
     </w:p>
     <w:p>
@@ -2019,8 +1865,8 @@
           <w:color w:val="000000"/>
         </w:rPr>
       </w:pPr>
-      <w:bookmarkStart w:id="13" w:name="bookmark=id.kgfqn9q6p3df" w:colFirst="0" w:colLast="0"/>
-      <w:bookmarkEnd w:id="13"/>
+      <w:bookmarkStart w:id="11" w:name="bookmark=id.kgfqn9q6p3df" w:colFirst="0" w:colLast="0"/>
+      <w:bookmarkEnd w:id="11"/>
       <w:r>
         <w:rPr>
           <w:i/>
@@ -2050,7 +1896,7 @@
         <w:rPr>
           <w:color w:val="000000"/>
         </w:rPr>
-        <w:t>In conventional AWS usage, engineers navigate across EC2, S3, VPC, and Cost Explorer consoles while maintaining custom scripts to bridge gaps between systems. This pattern increases handoff time and creates process variability. Nebula centralizes these interactions through uniform request and response semantics, reducing the need for service-specific workflow memorization.</w:t>
+        <w:t>In the traditional use of AWS, engineers move between EC2, S3, VPC, and Cost Explorer consoles with the custom scripts to fill the gaps between the systems. This trend adds to the extent of time during handoffs and introduces variability in the process. Nebula formalizes these interactions by providing homogeneous request and response semantics, decreasing the necessity of service.C. Governance and Cost Interpretability.</w:t>
       </w:r>
     </w:p>
     <w:p>
@@ -2078,8 +1924,8 @@
           <w:color w:val="000000"/>
         </w:rPr>
       </w:pPr>
-      <w:bookmarkStart w:id="14" w:name="bookmark=id.o472mus8pkxf" w:colFirst="0" w:colLast="0"/>
-      <w:bookmarkEnd w:id="14"/>
+      <w:bookmarkStart w:id="12" w:name="bookmark=id.o472mus8pkxf" w:colFirst="0" w:colLast="0"/>
+      <w:bookmarkEnd w:id="12"/>
       <w:r>
         <w:rPr>
           <w:i/>
@@ -2109,42 +1955,8 @@
         <w:rPr>
           <w:color w:val="000000"/>
         </w:rPr>
-        <w:t xml:space="preserve">Operational decisions are financially meaningful only when cost visibility is integrated into execution workflows </w:t>
-      </w:r>
-      <w:hyperlink w:anchor="_heading=h.tae7l93nslfo">
-        <w:r>
-          <w:rPr>
-            <w:color w:val="000000"/>
-          </w:rPr>
-          <w:t>[9],</w:t>
-        </w:r>
-      </w:hyperlink>
-      <w:r>
-        <w:rPr>
-          <w:color w:val="000000"/>
-        </w:rPr>
-        <w:t xml:space="preserve"> </w:t>
-      </w:r>
-      <w:hyperlink w:anchor="_heading=h.ua8satmn7nmq">
-        <w:r>
-          <w:rPr>
-            <w:color w:val="000000"/>
-          </w:rPr>
-          <w:t>[17].</w:t>
-        </w:r>
-      </w:hyperlink>
-      <w:r>
-        <w:rPr>
-          <w:color w:val="000000"/>
-        </w:rPr>
-        <w:t xml:space="preserve"> The platform links resource metadata and billing signals, enabling direct interpretation of spend structure by </w:t>
-      </w:r>
-      <w:r>
-        <w:rPr>
-          <w:color w:val="000000"/>
-        </w:rPr>
         <w:lastRenderedPageBreak/>
-        <w:t>service class. This reduces reporting delay and supports faster governance decisions at engineering level.</w:t>
+        <w:t>The financial significance of operational decisions can only be achieved when cost visibility is part of execution workflows [9], [17]. The platform interconnects resource metadata and billing indicators, providing the possibility to interpret the spend structure directly by the service type. This minimizes time to report and helps in quicker engineering-level governance decisions.D. Real Project Data Operational Standardization.</w:t>
       </w:r>
     </w:p>
     <w:p>
@@ -2172,8 +1984,8 @@
           <w:color w:val="000000"/>
         </w:rPr>
       </w:pPr>
-      <w:bookmarkStart w:id="15" w:name="bookmark=id.xsl69p2mbz0" w:colFirst="0" w:colLast="0"/>
-      <w:bookmarkEnd w:id="15"/>
+      <w:bookmarkStart w:id="13" w:name="bookmark=id.xsl69p2mbz0" w:colFirst="0" w:colLast="0"/>
+      <w:bookmarkEnd w:id="13"/>
       <w:r>
         <w:rPr>
           <w:i/>
@@ -2202,21 +2014,7 @@
         <w:rPr>
           <w:color w:val="000000"/>
         </w:rPr>
-        <w:t xml:space="preserve">Table </w:t>
-      </w:r>
-      <w:hyperlink w:anchor="_heading=h.ngmzcjehwb20">
-        <w:r>
-          <w:rPr>
-            <w:color w:val="000000"/>
-          </w:rPr>
-          <w:t>I</w:t>
-        </w:r>
-      </w:hyperlink>
-      <w:r>
-        <w:rPr>
-          <w:color w:val="000000"/>
-        </w:rPr>
-        <w:t xml:space="preserve"> compares traditional AWS operations with observed Nebula behavior from the implemented project.</w:t>
+        <w:t xml:space="preserve">Table I will compare the traditional AWS workings with the Nebula behavior observed in the implemented project. </w:t>
       </w:r>
     </w:p>
     <w:p>
@@ -2229,8 +2027,8 @@
           <w:szCs w:val="18"/>
         </w:rPr>
       </w:pPr>
-      <w:bookmarkStart w:id="16" w:name="_heading=h.ngmzcjehwb20" w:colFirst="0" w:colLast="0"/>
-      <w:bookmarkEnd w:id="16"/>
+      <w:bookmarkStart w:id="14" w:name="_heading=h.ngmzcjehwb20" w:colFirst="0" w:colLast="0"/>
+      <w:bookmarkEnd w:id="14"/>
       <w:r>
         <w:rPr>
           <w:sz w:val="18"/>
@@ -3368,8 +3166,8 @@
           <w:color w:val="000000"/>
         </w:rPr>
       </w:pPr>
-      <w:bookmarkStart w:id="17" w:name="bookmark=id.5fj7uznokcpy" w:colFirst="0" w:colLast="0"/>
-      <w:bookmarkEnd w:id="17"/>
+      <w:bookmarkStart w:id="15" w:name="bookmark=id.5fj7uznokcpy" w:colFirst="0" w:colLast="0"/>
+      <w:bookmarkEnd w:id="15"/>
     </w:p>
     <w:p>
       <w:pPr>
@@ -3391,31 +3189,13 @@
         <w:rPr>
           <w:color w:val="000000"/>
         </w:rPr>
-        <w:t xml:space="preserve">The comparison reveals three practical outcomes. First, process cadence becomes deterministic through scheduled synchronization, replacing </w:t>
-      </w:r>
-      <w:r>
-        <w:rPr>
-          <w:color w:val="000000"/>
-        </w:rPr>
-        <w:t>ad hoc</w:t>
-      </w:r>
-      <w:r>
-        <w:rPr>
-          <w:color w:val="000000"/>
-        </w:rPr>
-        <w:t xml:space="preserve"> checks. Second, control-plane responsiveness is preserved through asynchronous design, so user interaction does not wait for infrastructure runtime. Third, cost and health telemetry are operationalized as first-class workflow outputs rather than post-facto reports.</w:t>
-      </w:r>
-      <w:r>
-        <w:rPr>
-          <w:color w:val="000000"/>
-        </w:rPr>
-        <w:t xml:space="preserve"> </w:t>
-      </w:r>
-      <w:r>
-        <w:rPr>
-          <w:color w:val="000000"/>
-        </w:rPr>
-        <w:t>From an organizational perspective, this has additional implications. Standardized flow definitions reduce on- boarding friction for new operators and improve traceability for compliance-oriented reviews. In short, the platform transforms AWS operations from service-centric execution to workflow-centric execution.</w:t>
+        <w:t>The comparison shows three applied results. First, scheduled synchronization makes process cadence deterministic, as opposed to ad hoc checks. Second, the asynchronous design is maintained to ensure control-plane responsiveness when the user interaction does not block on infrastructure runtime. Third, cost and health telemetry are modeled as first-class workflow products, instead of post-facto reports. This has further implications on an organizational level. Standardized flow definitions will minimize the on- boarding friction on new operators and enhance traceability on compliance-oriented reviews. Concisely, the platform will make AWS operations less service-oriented execution and more workflow-oriented execution</w:t>
+      </w:r>
+      <w:r>
+        <w:rPr>
+          <w:color w:val="000000"/>
+        </w:rPr>
+        <w:t>.</w:t>
       </w:r>
     </w:p>
     <w:p>
@@ -3443,8 +3223,8 @@
           <w:color w:val="000000"/>
         </w:rPr>
       </w:pPr>
-      <w:bookmarkStart w:id="18" w:name="bookmark=id.pb9lsfiiua49" w:colFirst="0" w:colLast="0"/>
-      <w:bookmarkEnd w:id="18"/>
+      <w:bookmarkStart w:id="16" w:name="bookmark=id.pb9lsfiiua49" w:colFirst="0" w:colLast="0"/>
+      <w:bookmarkEnd w:id="16"/>
       <w:r>
         <w:rPr>
           <w:i/>
@@ -3474,7 +3254,7 @@
         <w:rPr>
           <w:color w:val="000000"/>
         </w:rPr>
-        <w:t>Although this phase is AWS-specific, the standardized control logic is intentionally architected for extension. The immediate strategic value is therefore two-layered: near-term reduction in operational inconsistency and long-term readiness for provider diversification once baseline reliability targets are consistently met.</w:t>
+        <w:t>This phase is AWS-specific, but the standardized control logic is also deliberately designed to be extended. The short-term strategic value is thus two-fold: short-term decrease in the inconsistency in operations and long-term preparation to diversify providers in case of consistent achievement of the baseline reliability levels.</w:t>
       </w:r>
     </w:p>
     <w:p>
@@ -3496,8 +3276,8 @@
         <w:spacing w:before="152"/>
         <w:ind w:left="3788" w:hanging="378"/>
       </w:pPr>
-      <w:bookmarkStart w:id="19" w:name="bookmark=id.jfqfbajra9pt" w:colFirst="0" w:colLast="0"/>
-      <w:bookmarkEnd w:id="19"/>
+      <w:bookmarkStart w:id="17" w:name="bookmark=id.jfqfbajra9pt" w:colFirst="0" w:colLast="0"/>
+      <w:bookmarkEnd w:id="17"/>
       <w:r>
         <w:rPr>
           <w:smallCaps/>
@@ -3526,7 +3306,7 @@
         <w:rPr>
           <w:color w:val="000000"/>
         </w:rPr>
-        <w:t>The current implementation of Nebula prioritizes deterministic provisioning and reliable telemetry collection. On top of this baseline, the project defines an “intelligence layer” intended to improve operational decisions without replacing operator control.</w:t>
+        <w:t>Deterministic provisioning and dependable collection of telemetry is a priority in the current implementation of Nebula. Above this foundation the project outlines an intelligence layer that is meant to enhance operational decisions without usurping operator control.</w:t>
       </w:r>
     </w:p>
     <w:p>
@@ -3554,8 +3334,8 @@
           <w:color w:val="000000"/>
         </w:rPr>
       </w:pPr>
-      <w:bookmarkStart w:id="20" w:name="bookmark=id.bb743ta0sqel" w:colFirst="0" w:colLast="0"/>
-      <w:bookmarkEnd w:id="20"/>
+      <w:bookmarkStart w:id="18" w:name="bookmark=id.bb743ta0sqel" w:colFirst="0" w:colLast="0"/>
+      <w:bookmarkEnd w:id="18"/>
       <w:r>
         <w:rPr>
           <w:i/>
@@ -3585,7 +3365,13 @@
         <w:rPr>
           <w:color w:val="000000"/>
         </w:rPr>
-        <w:t>A common failure pattern in cloud tooling is adding predictive features before stabilizing operational data pipelines. This work takes the opposite route: synchronization, state tracking, and cost collection are treated as prerequisites for trustworthy recommendations. In this context, AI integration is positioned as a decision-support capability rather than an autonomous control loop.</w:t>
+        <w:t>Another frequent cloud tooling failure mode is to add predictive capabilities without first having operational data pipelines in place. This article follows a different path: synchronization, state tracking, and cost collection are considered as the prerequisites to credible recommendations. Here, the integration of AI is placed as a decision-support feature and not an autonomous control loop</w:t>
+      </w:r>
+      <w:r>
+        <w:rPr>
+          <w:color w:val="000000"/>
+        </w:rPr>
+        <w:t>.</w:t>
       </w:r>
     </w:p>
     <w:p>
@@ -3613,8 +3399,8 @@
           <w:color w:val="000000"/>
         </w:rPr>
       </w:pPr>
-      <w:bookmarkStart w:id="21" w:name="bookmark=id.1z9a6kn0gafc" w:colFirst="0" w:colLast="0"/>
-      <w:bookmarkEnd w:id="21"/>
+      <w:bookmarkStart w:id="19" w:name="bookmark=id.1z9a6kn0gafc" w:colFirst="0" w:colLast="0"/>
+      <w:bookmarkEnd w:id="19"/>
       <w:r>
         <w:rPr>
           <w:i/>
@@ -3644,48 +3430,14 @@
         <w:rPr>
           <w:color w:val="000000"/>
         </w:rPr>
-        <w:t xml:space="preserve">Using historical utilization indicators, the platform can recommend right-sized EC2 instance classes and flag persistent over-provisioning patterns </w:t>
-      </w:r>
-      <w:hyperlink w:anchor="_heading=h.51fzq4rjykob">
-        <w:r>
-          <w:rPr>
-            <w:color w:val="000000"/>
-          </w:rPr>
-          <w:t>[18],</w:t>
-        </w:r>
-      </w:hyperlink>
-      <w:r>
-        <w:rPr>
-          <w:color w:val="000000"/>
-        </w:rPr>
-        <w:t xml:space="preserve"> </w:t>
-      </w:r>
-      <w:hyperlink w:anchor="_heading=h.dg6hft20ttd9">
-        <w:r>
-          <w:rPr>
-            <w:color w:val="000000"/>
-          </w:rPr>
-          <w:t>[19].</w:t>
-        </w:r>
-      </w:hyperlink>
-      <w:r>
-        <w:rPr>
-          <w:color w:val="000000"/>
-        </w:rPr>
-        <w:t xml:space="preserve"> For example, workloads with low sustained utilization can be mapped from larger families toward burstable tiers such as </w:t>
-      </w:r>
-      <w:r>
-        <w:rPr>
-          <w:rFonts w:ascii="Courier New" w:eastAsia="Courier New" w:hAnsi="Courier New" w:cs="Courier New"/>
-          <w:color w:val="000000"/>
-        </w:rPr>
-        <w:t>t3.medium</w:t>
-      </w:r>
-      <w:r>
-        <w:rPr>
-          <w:color w:val="000000"/>
-        </w:rPr>
-        <w:t>, reducing excess compute spend while preserving application availability targets.</w:t>
+        <w:t xml:space="preserve">The platform may suggest the correct instance classes of EC2 and alert on history of over-provisioning using </w:t>
+      </w:r>
+      <w:r>
+        <w:rPr>
+          <w:color w:val="000000"/>
+        </w:rPr>
+        <w:lastRenderedPageBreak/>
+        <w:t>historical utilization indicators [18], [19]. An illustrative example is that low sustained utilization workloads can be scaled down large families to burstable levels like t3.medium to minimize unnecessary spend on compute resources and maintain application availability goals.C. Utilization Anomaly Detection.</w:t>
       </w:r>
     </w:p>
     <w:p>
@@ -3713,15 +3465,14 @@
           <w:color w:val="000000"/>
         </w:rPr>
       </w:pPr>
-      <w:bookmarkStart w:id="22" w:name="bookmark=id.wvsyz8vd5g5o" w:colFirst="0" w:colLast="0"/>
-      <w:bookmarkEnd w:id="22"/>
+      <w:bookmarkStart w:id="20" w:name="bookmark=id.wvsyz8vd5g5o" w:colFirst="0" w:colLast="0"/>
+      <w:bookmarkEnd w:id="20"/>
       <w:r>
         <w:rPr>
           <w:i/>
           <w:iCs/>
           <w:color w:val="000000"/>
         </w:rPr>
-        <w:lastRenderedPageBreak/>
         <w:t>Utilization Anomaly Detection</w:t>
       </w:r>
     </w:p>
@@ -3745,21 +3496,13 @@
         <w:rPr>
           <w:color w:val="000000"/>
         </w:rPr>
-        <w:t xml:space="preserve">Anomaly detection in AWS telemetry can identify abrupt deviations in activity and cost signatures. Such deviations may indicate configuration errors, demand spikes, unoptimized scaling policies, or potentially malicious consumption patterns </w:t>
-      </w:r>
-      <w:hyperlink w:anchor="_heading=h.6jx81zk26b37">
-        <w:r>
-          <w:rPr>
-            <w:color w:val="000000"/>
-          </w:rPr>
-          <w:t>[20].</w:t>
-        </w:r>
-      </w:hyperlink>
-      <w:r>
-        <w:rPr>
-          <w:color w:val="000000"/>
-        </w:rPr>
-        <w:t xml:space="preserve"> In practical terms, anomaly output can be linked to alerting and investigation workflows rather than automatic destructive actions, preserving operational safety.</w:t>
+        <w:t>AWS anomaly detectors can detect sudden changes in activity and cost signatures. These deviations can be seen as configuration mistakes, a burst of demand, non-optimal scaling policies, or even malicious consumption [20]. Practically, anomaly output may be connected with alerting and investigation processes instead of automatic destructive measures, which will not harm operational safety</w:t>
+      </w:r>
+      <w:r>
+        <w:rPr>
+          <w:color w:val="000000"/>
+        </w:rPr>
+        <w:t>.</w:t>
       </w:r>
     </w:p>
     <w:p>
@@ -3787,8 +3530,8 @@
           <w:color w:val="000000"/>
         </w:rPr>
       </w:pPr>
-      <w:bookmarkStart w:id="23" w:name="bookmark=id.kil2dcb2p7t6" w:colFirst="0" w:colLast="0"/>
-      <w:bookmarkEnd w:id="23"/>
+      <w:bookmarkStart w:id="21" w:name="bookmark=id.kil2dcb2p7t6" w:colFirst="0" w:colLast="0"/>
+      <w:bookmarkEnd w:id="21"/>
       <w:r>
         <w:rPr>
           <w:i/>
@@ -3818,21 +3561,7 @@
         <w:rPr>
           <w:color w:val="000000"/>
         </w:rPr>
-        <w:t xml:space="preserve">Cost signals become more useful when correlated with resource state and tags. Nebula’s planned recommendation layer identifies candidates for cleanup (idle resources, unattached components, underused instances) and surfaces ranked actions with expected financial impact </w:t>
-      </w:r>
-      <w:hyperlink w:anchor="_heading=h.moysswa52r7p">
-        <w:r>
-          <w:rPr>
-            <w:color w:val="000000"/>
-          </w:rPr>
-          <w:t>[21].</w:t>
-        </w:r>
-      </w:hyperlink>
-      <w:r>
-        <w:rPr>
-          <w:color w:val="000000"/>
-        </w:rPr>
-        <w:t xml:space="preserve"> This framing keeps optimization actionable and auditable.</w:t>
+        <w:t>When used with resource state and tags, cost signals are more useful. The intended recommendation layer by Nebula selects the cleanup candidates (idle resources, unattached components, underutilized instances) and exposes ranked actions that have a likely financial outcome [21]. This framing makes optimization actionable and audit-oriented.E. AWS Mapping and Abstraction Layer.</w:t>
       </w:r>
     </w:p>
     <w:p>
@@ -3859,8 +3588,8 @@
           <w:color w:val="000000"/>
         </w:rPr>
       </w:pPr>
-      <w:bookmarkStart w:id="24" w:name="bookmark=id.t4gqrq9ibvly" w:colFirst="0" w:colLast="0"/>
-      <w:bookmarkEnd w:id="24"/>
+      <w:bookmarkStart w:id="22" w:name="bookmark=id.t4gqrq9ibvly" w:colFirst="0" w:colLast="0"/>
+      <w:bookmarkEnd w:id="22"/>
       <w:r>
         <w:rPr>
           <w:i/>
@@ -3879,53 +3608,17 @@
           <w:right w:val="nil"/>
           <w:between w:val="nil"/>
         </w:pBdr>
-        <w:spacing w:before="83"/>
-        <w:ind w:left="478"/>
-        <w:rPr>
-          <w:color w:val="000000"/>
-        </w:rPr>
-      </w:pPr>
-      <w:r>
-        <w:rPr>
-          <w:color w:val="000000"/>
-        </w:rPr>
-        <w:t>A robust intelligence layer requires stable semantic mapping between user intent and provider-native resources.</w:t>
-      </w:r>
-    </w:p>
-    <w:p>
-      <w:pPr>
-        <w:pBdr>
-          <w:top w:val="nil"/>
-          <w:left w:val="nil"/>
-          <w:bottom w:val="nil"/>
-          <w:right w:val="nil"/>
-          <w:between w:val="nil"/>
-        </w:pBdr>
         <w:spacing w:before="14"/>
-        <w:ind w:left="259"/>
-        <w:rPr>
-          <w:color w:val="000000"/>
-        </w:rPr>
-      </w:pPr>
-      <w:r>
-        <w:rPr>
-          <w:color w:val="000000"/>
-        </w:rPr>
-        <w:t xml:space="preserve">Table </w:t>
-      </w:r>
-      <w:hyperlink w:anchor="_heading=h.k27i5ugmgbug">
-        <w:r>
-          <w:rPr>
-            <w:color w:val="000000"/>
-          </w:rPr>
-          <w:t>II</w:t>
-        </w:r>
-      </w:hyperlink>
-      <w:r>
-        <w:rPr>
-          <w:color w:val="000000"/>
-        </w:rPr>
-        <w:t xml:space="preserve"> summarizes the current abstraction design.</w:t>
+        <w:ind w:left="259" w:firstLine="297"/>
+        <w:rPr>
+          <w:color w:val="000000"/>
+        </w:rPr>
+      </w:pPr>
+      <w:r>
+        <w:rPr>
+          <w:color w:val="000000"/>
+        </w:rPr>
+        <w:t>An effective intelligence layer must have a consistent semantic mapping of user desire and provider native assets. Table II is a summary of the existing abstraction design.</w:t>
       </w:r>
     </w:p>
     <w:p>
@@ -3952,8 +3645,8 @@
           <w:szCs w:val="18"/>
         </w:rPr>
       </w:pPr>
-      <w:bookmarkStart w:id="25" w:name="_heading=h.k27i5ugmgbug" w:colFirst="0" w:colLast="0"/>
-      <w:bookmarkEnd w:id="25"/>
+      <w:bookmarkStart w:id="23" w:name="_heading=h.k27i5ugmgbug" w:colFirst="0" w:colLast="0"/>
+      <w:bookmarkEnd w:id="23"/>
       <w:r>
         <w:rPr>
           <w:sz w:val="18"/>
@@ -4624,8 +4317,8 @@
           <w:color w:val="000000"/>
         </w:rPr>
       </w:pPr>
-      <w:bookmarkStart w:id="26" w:name="bookmark=id.uwd5fptvu62b" w:colFirst="0" w:colLast="0"/>
-      <w:bookmarkEnd w:id="26"/>
+      <w:bookmarkStart w:id="24" w:name="bookmark=id.uwd5fptvu62b" w:colFirst="0" w:colLast="0"/>
+      <w:bookmarkEnd w:id="24"/>
       <w:r>
         <w:rPr>
           <w:i/>
@@ -4655,7 +4348,13 @@
         <w:rPr>
           <w:color w:val="000000"/>
         </w:rPr>
-        <w:t>Even in its planned form, the intelligence strategy contributes to the paper’s thesis: standardization is not only about provisioning APIs, but also about producing data quality sufficient for reliable optimization. The more consistent the operational substrate, the more defensible AI-guided decisions become.</w:t>
+        <w:t>Although it is planned, the intelligence strategy helps the paper to advance its thesis: standardization is not just a matter of the provisioning of APIs, but the generation of data quality that will enable reliable optimization. The more uniform the operational substrate is, the more justifiable AI-informed decisions are</w:t>
+      </w:r>
+      <w:r>
+        <w:rPr>
+          <w:color w:val="000000"/>
+        </w:rPr>
+        <w:t>.</w:t>
       </w:r>
     </w:p>
     <w:p>
@@ -4677,8 +4376,8 @@
         <w:spacing w:before="151"/>
         <w:ind w:left="4254" w:hanging="295"/>
       </w:pPr>
-      <w:bookmarkStart w:id="27" w:name="bookmark=id.m0g9xt7axex7" w:colFirst="0" w:colLast="0"/>
-      <w:bookmarkEnd w:id="27"/>
+      <w:bookmarkStart w:id="25" w:name="bookmark=id.m0g9xt7axex7" w:colFirst="0" w:colLast="0"/>
+      <w:bookmarkEnd w:id="25"/>
       <w:r>
         <w:rPr>
           <w:smallCaps/>
@@ -4707,7 +4406,13 @@
         <w:rPr>
           <w:color w:val="000000"/>
         </w:rPr>
-        <w:t>The implementation of Nebula is designed as an AWS-focused orchestration stack that translates user intent into reproducible infrastructure actions. The implementation objective is not only feature delivery, but operational determinism: identical inputs should result in predictable execution paths, auditable state transitions, and observable outcomes.</w:t>
+        <w:t>Nebula implementation is created as an AWS-oriented orchestration stack that converts user intent into infrastructure actions that can be repeated. Delivering features is not the only goal of implementation; it is also operational determinism: the same inputs should lead to predictable execution paths, auditable state transitions, and observable results</w:t>
+      </w:r>
+      <w:r>
+        <w:rPr>
+          <w:color w:val="000000"/>
+        </w:rPr>
+        <w:t>.</w:t>
       </w:r>
     </w:p>
     <w:p>
@@ -4734,8 +4439,8 @@
           <w:color w:val="000000"/>
         </w:rPr>
       </w:pPr>
-      <w:bookmarkStart w:id="28" w:name="bookmark=id.mnazzuh1s06q" w:colFirst="0" w:colLast="0"/>
-      <w:bookmarkEnd w:id="28"/>
+      <w:bookmarkStart w:id="26" w:name="bookmark=id.mnazzuh1s06q" w:colFirst="0" w:colLast="0"/>
+      <w:bookmarkEnd w:id="26"/>
       <w:r>
         <w:rPr>
           <w:i/>
@@ -4764,7 +4469,13 @@
         <w:rPr>
           <w:color w:val="000000"/>
         </w:rPr>
-        <w:t>The platform is built around four design principles:</w:t>
+        <w:t>The system is designed based on four design principles</w:t>
+      </w:r>
+      <w:r>
+        <w:rPr>
+          <w:color w:val="000000"/>
+        </w:rPr>
+        <w:t>:</w:t>
       </w:r>
     </w:p>
     <w:p>
@@ -4927,8 +4638,8 @@
           <w:color w:val="000000"/>
         </w:rPr>
       </w:pPr>
-      <w:bookmarkStart w:id="29" w:name="bookmark=id.jsy9zbnlatow" w:colFirst="0" w:colLast="0"/>
-      <w:bookmarkEnd w:id="29"/>
+      <w:bookmarkStart w:id="27" w:name="bookmark=id.jsy9zbnlatow" w:colFirst="0" w:colLast="0"/>
+      <w:bookmarkEnd w:id="27"/>
       <w:r>
         <w:rPr>
           <w:i/>
@@ -4955,74 +4666,14 @@
         <w:rPr>
           <w:color w:val="000000"/>
         </w:rPr>
-        <w:t xml:space="preserve">Each layer of the system uses a well-established toolchain with explicit technical purpose and documented references, summarized in Table </w:t>
-      </w:r>
-      <w:hyperlink w:anchor="_heading=h.hwguswwqpvxz">
-        <w:r>
-          <w:rPr>
-            <w:color w:val="000000"/>
-          </w:rPr>
-          <w:t>III.</w:t>
-        </w:r>
-      </w:hyperlink>
-      <w:bookmarkStart w:id="30" w:name="_heading=h.hwguswwqpvxz" w:colFirst="0" w:colLast="0"/>
-      <w:bookmarkEnd w:id="30"/>
-    </w:p>
-    <w:p>
-      <w:pPr>
-        <w:pBdr>
-          <w:top w:val="nil"/>
-          <w:left w:val="nil"/>
-          <w:bottom w:val="nil"/>
-          <w:right w:val="nil"/>
-          <w:between w:val="nil"/>
-        </w:pBdr>
-        <w:spacing w:before="83" w:line="252" w:lineRule="auto"/>
-        <w:ind w:right="257"/>
-        <w:jc w:val="both"/>
-      </w:pPr>
-    </w:p>
-    <w:p>
-      <w:pPr>
-        <w:pBdr>
-          <w:top w:val="nil"/>
-          <w:left w:val="nil"/>
-          <w:bottom w:val="nil"/>
-          <w:right w:val="nil"/>
-          <w:between w:val="nil"/>
-        </w:pBdr>
-        <w:spacing w:before="83" w:line="252" w:lineRule="auto"/>
-        <w:ind w:left="259" w:right="257" w:firstLine="219"/>
-        <w:jc w:val="both"/>
-      </w:pPr>
-    </w:p>
-    <w:p>
-      <w:pPr>
-        <w:pBdr>
-          <w:top w:val="nil"/>
-          <w:left w:val="nil"/>
-          <w:bottom w:val="nil"/>
-          <w:right w:val="nil"/>
-          <w:between w:val="nil"/>
-        </w:pBdr>
-        <w:spacing w:before="83" w:line="252" w:lineRule="auto"/>
-        <w:ind w:left="259" w:right="257" w:firstLine="219"/>
-        <w:jc w:val="both"/>
-      </w:pPr>
-    </w:p>
-    <w:p>
-      <w:pPr>
-        <w:pBdr>
-          <w:top w:val="nil"/>
-          <w:left w:val="nil"/>
-          <w:bottom w:val="nil"/>
-          <w:right w:val="nil"/>
-          <w:between w:val="nil"/>
-        </w:pBdr>
-        <w:spacing w:before="83" w:line="252" w:lineRule="auto"/>
-        <w:ind w:left="259" w:right="257" w:firstLine="219"/>
-        <w:jc w:val="both"/>
-      </w:pPr>
+        <w:t>Every system tier includes a proven toolchain with clearly defined technical intent and that is documented, as summarized in Table III</w:t>
+      </w:r>
+      <w:r>
+        <w:rPr>
+          <w:color w:val="000000"/>
+        </w:rPr>
+        <w:t>.</w:t>
+      </w:r>
     </w:p>
     <w:p>
       <w:pPr>
@@ -6947,8 +6598,8 @@
           <w:color w:val="000000"/>
         </w:rPr>
       </w:pPr>
-      <w:bookmarkStart w:id="31" w:name="bookmark=id.wlqqhb9sh04k" w:colFirst="0" w:colLast="0"/>
-      <w:bookmarkEnd w:id="31"/>
+      <w:bookmarkStart w:id="28" w:name="bookmark=id.wlqqhb9sh04k" w:colFirst="0" w:colLast="0"/>
+      <w:bookmarkEnd w:id="28"/>
       <w:r>
         <w:rPr>
           <w:i/>
@@ -9378,7 +9029,6 @@
           <w:sz w:val="18"/>
           <w:szCs w:val="18"/>
         </w:rPr>
-        <w:lastRenderedPageBreak/>
         <w:t xml:space="preserve">Fig. </w:t>
       </w:r>
       <w:r>
@@ -9436,16 +9086,17 @@
           <w:color w:val="000000"/>
         </w:rPr>
       </w:pPr>
-      <w:bookmarkStart w:id="32" w:name="bookmark=id.s7zpwq1fr9wz" w:colFirst="0" w:colLast="0"/>
-      <w:bookmarkStart w:id="33" w:name="bookmark=id.6ti7hlrdpejk" w:colFirst="0" w:colLast="0"/>
-      <w:bookmarkEnd w:id="32"/>
-      <w:bookmarkEnd w:id="33"/>
+      <w:bookmarkStart w:id="29" w:name="bookmark=id.s7zpwq1fr9wz" w:colFirst="0" w:colLast="0"/>
+      <w:bookmarkStart w:id="30" w:name="bookmark=id.6ti7hlrdpejk" w:colFirst="0" w:colLast="0"/>
+      <w:bookmarkEnd w:id="29"/>
+      <w:bookmarkEnd w:id="30"/>
       <w:r>
         <w:rPr>
           <w:i/>
           <w:iCs/>
           <w:color w:val="000000"/>
         </w:rPr>
+        <w:lastRenderedPageBreak/>
         <w:t>Core Execution Workflows</w:t>
       </w:r>
     </w:p>
@@ -9468,8 +9119,8 @@
         <w:spacing w:before="83" w:line="252" w:lineRule="auto"/>
         <w:ind w:right="257" w:firstLine="219"/>
       </w:pPr>
-      <w:bookmarkStart w:id="34" w:name="bookmark=id.czv96ckofbv8" w:colFirst="0" w:colLast="0"/>
-      <w:bookmarkEnd w:id="34"/>
+      <w:bookmarkStart w:id="31" w:name="bookmark=id.czv96ckofbv8" w:colFirst="0" w:colLast="0"/>
+      <w:bookmarkEnd w:id="31"/>
       <w:r>
         <w:rPr>
           <w:i/>
@@ -9482,15 +9133,13 @@
         <w:rPr>
           <w:color w:val="000000"/>
         </w:rPr>
-        <w:t xml:space="preserve">The authentication path uses JWT-based authorization, where frontend credentials are </w:t>
-      </w:r>
-      <w:bookmarkStart w:id="35" w:name="bookmark=id.y74h3j3zln3e" w:colFirst="0" w:colLast="0"/>
-      <w:bookmarkEnd w:id="35"/>
-      <w:r>
-        <w:rPr>
-          <w:color w:val="000000"/>
-        </w:rPr>
-        <w:t>validated by the API and a signed token is returned for subsequent calls.</w:t>
+        <w:t>Authentication flow is a JWT based authorization where authentication of front end credentials occurs through the API and a signed token is issued to be used in future calls</w:t>
+      </w:r>
+      <w:r>
+        <w:rPr>
+          <w:color w:val="000000"/>
+        </w:rPr>
+        <w:t>.</w:t>
       </w:r>
     </w:p>
     <w:p>
@@ -9551,8 +9200,8 @@
           <w:color w:val="000000"/>
         </w:rPr>
       </w:pPr>
-      <w:bookmarkStart w:id="36" w:name="bookmark=id.qro1pl8bwukv" w:colFirst="0" w:colLast="0"/>
-      <w:bookmarkEnd w:id="36"/>
+      <w:bookmarkStart w:id="32" w:name="bookmark=id.qro1pl8bwukv" w:colFirst="0" w:colLast="0"/>
+      <w:bookmarkEnd w:id="32"/>
       <w:r>
         <w:rPr>
           <w:i/>
@@ -9608,8 +9257,8 @@
           <w:color w:val="000000"/>
         </w:rPr>
       </w:pPr>
-      <w:bookmarkStart w:id="37" w:name="bookmark=id.qoxma4qook1d" w:colFirst="0" w:colLast="0"/>
-      <w:bookmarkEnd w:id="37"/>
+      <w:bookmarkStart w:id="33" w:name="bookmark=id.qoxma4qook1d" w:colFirst="0" w:colLast="0"/>
+      <w:bookmarkEnd w:id="33"/>
       <w:r>
         <w:rPr>
           <w:i/>
@@ -9862,8 +9511,8 @@
           <w:color w:val="000000"/>
         </w:rPr>
       </w:pPr>
-      <w:bookmarkStart w:id="38" w:name="bookmark=id.rlhivcrb4ygb" w:colFirst="0" w:colLast="0"/>
-      <w:bookmarkEnd w:id="38"/>
+      <w:bookmarkStart w:id="34" w:name="bookmark=id.rlhivcrb4ygb" w:colFirst="0" w:colLast="0"/>
+      <w:bookmarkEnd w:id="34"/>
       <w:r>
         <w:rPr>
           <w:i/>
@@ -10055,8 +9704,8 @@
           <w:color w:val="000000"/>
         </w:rPr>
       </w:pPr>
-      <w:bookmarkStart w:id="39" w:name="bookmark=id.lfoa483ag433" w:colFirst="0" w:colLast="0"/>
-      <w:bookmarkEnd w:id="39"/>
+      <w:bookmarkStart w:id="35" w:name="bookmark=id.lfoa483ag433" w:colFirst="0" w:colLast="0"/>
+      <w:bookmarkEnd w:id="35"/>
       <w:r>
         <w:rPr>
           <w:i/>
@@ -10086,74 +9735,13 @@
         <w:rPr>
           <w:color w:val="000000"/>
         </w:rPr>
-        <w:t xml:space="preserve">The core provisioning routine in </w:t>
-      </w:r>
-      <w:r>
-        <w:rPr>
-          <w:rFonts w:ascii="Courier New" w:eastAsia="Courier New" w:hAnsi="Courier New" w:cs="Courier New"/>
-          <w:color w:val="000000"/>
-        </w:rPr>
-        <w:t xml:space="preserve">terraform_tasks.py </w:t>
-      </w:r>
-      <w:r>
-        <w:rPr>
-          <w:color w:val="000000"/>
-        </w:rPr>
-        <w:t xml:space="preserve">dynamically creates a workspace, injects provider credentials as environment variables, and executes the three-stage Terraform lifecycle: </w:t>
-      </w:r>
-      <w:r>
-        <w:rPr>
-          <w:i/>
-          <w:iCs/>
-          <w:color w:val="000000"/>
-        </w:rPr>
-        <w:t>init</w:t>
-      </w:r>
-      <w:r>
-        <w:rPr>
-          <w:color w:val="000000"/>
-        </w:rPr>
-        <w:t xml:space="preserve">, </w:t>
-      </w:r>
-      <w:r>
-        <w:rPr>
-          <w:i/>
-          <w:iCs/>
-          <w:color w:val="000000"/>
-        </w:rPr>
-        <w:t>plan</w:t>
-      </w:r>
-      <w:r>
-        <w:rPr>
-          <w:color w:val="000000"/>
-        </w:rPr>
-        <w:t xml:space="preserve">, and </w:t>
-      </w:r>
-      <w:r>
-        <w:rPr>
-          <w:i/>
-          <w:iCs/>
-          <w:color w:val="000000"/>
-        </w:rPr>
-        <w:t>apply</w:t>
-      </w:r>
-      <w:r>
-        <w:rPr>
-          <w:color w:val="000000"/>
-        </w:rPr>
-        <w:t>. Failure</w:t>
-      </w:r>
-      <w:r>
-        <w:rPr>
-          <w:color w:val="000000"/>
-        </w:rPr>
-        <w:t xml:space="preserve"> </w:t>
-      </w:r>
-      <w:r>
-        <w:rPr>
-          <w:color w:val="000000"/>
-        </w:rPr>
-        <w:t>handling is explicit: if initialization, planning, or apply stages fail, resource state is marked accordingly and execution logs are persisted for diagnostics. This behavior is essential for operational transparency in asynchronous systems.</w:t>
+        <w:t>The main terraform tasks.py provisioning process is dynamic, and it builds working environment, sets provider credentials as environment variables, and runs three-step Terraform lifecycle init, plan, and apply. Failure behavior is defined: in case of failure in any of the steps of the initialisation, planning, or apply phases, the resource state is set to fail and execution logs are saved to aid in diagnostics. This is a critical behavior to operational transparency in asynchronous systems</w:t>
+      </w:r>
+      <w:r>
+        <w:rPr>
+          <w:color w:val="000000"/>
+        </w:rPr>
+        <w:t>.</w:t>
       </w:r>
     </w:p>
     <w:p>
@@ -10181,8 +9769,8 @@
           <w:color w:val="000000"/>
         </w:rPr>
       </w:pPr>
-      <w:bookmarkStart w:id="40" w:name="bookmark=id.fppnv5hrl8au" w:colFirst="0" w:colLast="0"/>
-      <w:bookmarkEnd w:id="40"/>
+      <w:bookmarkStart w:id="36" w:name="bookmark=id.fppnv5hrl8au" w:colFirst="0" w:colLast="0"/>
+      <w:bookmarkEnd w:id="36"/>
       <w:r>
         <w:rPr>
           <w:i/>
@@ -10234,8 +9822,8 @@
         <w:spacing w:before="143"/>
         <w:ind w:left="3552" w:hanging="406"/>
       </w:pPr>
-      <w:bookmarkStart w:id="41" w:name="bookmark=id.cpxd51123462" w:colFirst="0" w:colLast="0"/>
-      <w:bookmarkEnd w:id="41"/>
+      <w:bookmarkStart w:id="37" w:name="bookmark=id.cpxd51123462" w:colFirst="0" w:colLast="0"/>
+      <w:bookmarkEnd w:id="37"/>
       <w:r>
         <w:rPr>
           <w:smallCaps/>
@@ -10264,7 +9852,7 @@
         <w:rPr>
           <w:color w:val="000000"/>
         </w:rPr>
-        <w:t>This section evaluates Nebula using implementation-level evidence from the AWS-backed deployment. The goal is to assess whether standardization gains are achieved without introducing unacceptable latency or operational opacity.</w:t>
+        <w:t>This section assesses Nebula based on implementation-level evidence based on the deployment supported by AWS. It aims to determine whether or not the standardization gains are attained without imposing unacceptable latency or operational opaqueness.A. Scope and Method of Measurement.</w:t>
       </w:r>
     </w:p>
     <w:p>
@@ -10292,8 +9880,8 @@
           <w:color w:val="000000"/>
         </w:rPr>
       </w:pPr>
-      <w:bookmarkStart w:id="42" w:name="bookmark=id.3iz74qfsqu1m" w:colFirst="0" w:colLast="0"/>
-      <w:bookmarkEnd w:id="42"/>
+      <w:bookmarkStart w:id="38" w:name="bookmark=id.3iz74qfsqu1m" w:colFirst="0" w:colLast="0"/>
+      <w:bookmarkEnd w:id="38"/>
       <w:r>
         <w:rPr>
           <w:i/>
@@ -10323,7 +9911,30 @@
         <w:rPr>
           <w:color w:val="000000"/>
         </w:rPr>
-        <w:t>The evaluation focuses on control-plane behavior rather than raw cloud hardware performance. Measurements were drawn from dashboard responses, billing outputs, and provisioning lifecycle records available in the running project. The observed sample emphasizes practical operator-facing metrics:</w:t>
+        <w:t>The test is conducted on the behavior of control planes and not the actual performance of cloud hardware. Dashboard responses, billing outputs and provisioning lifecycle records in the running project were used to draw measures.</w:t>
+      </w:r>
+    </w:p>
+    <w:p>
+      <w:pPr>
+        <w:pBdr>
+          <w:top w:val="nil"/>
+          <w:left w:val="nil"/>
+          <w:bottom w:val="nil"/>
+          <w:right w:val="nil"/>
+          <w:between w:val="nil"/>
+        </w:pBdr>
+        <w:spacing w:before="81" w:line="252" w:lineRule="auto"/>
+        <w:ind w:left="259" w:right="257" w:firstLine="219"/>
+        <w:jc w:val="both"/>
+        <w:rPr>
+          <w:color w:val="000000"/>
+        </w:rPr>
+      </w:pPr>
+      <w:r>
+        <w:rPr>
+          <w:color w:val="000000"/>
+        </w:rPr>
+        <w:t>The observed sample emphasizes practical operator-facing metrics:</w:t>
       </w:r>
     </w:p>
     <w:p>
@@ -10499,7 +10110,6 @@
         <w:rPr>
           <w:color w:val="000000"/>
         </w:rPr>
-        <w:lastRenderedPageBreak/>
         <w:t xml:space="preserve">Table </w:t>
       </w:r>
       <w:hyperlink w:anchor="_heading=h.n3l66oj7ytms">
@@ -10526,31 +10136,12 @@
           <w:szCs w:val="18"/>
         </w:rPr>
       </w:pPr>
-    </w:p>
-    <w:p>
-      <w:pPr>
-        <w:ind w:left="243" w:right="243"/>
-        <w:jc w:val="center"/>
+      <w:r>
         <w:rPr>
           <w:sz w:val="18"/>
           <w:szCs w:val="18"/>
         </w:rPr>
-      </w:pPr>
-    </w:p>
-    <w:p>
-      <w:pPr>
-        <w:ind w:left="243" w:right="243"/>
-        <w:jc w:val="center"/>
-        <w:rPr>
-          <w:sz w:val="18"/>
-          <w:szCs w:val="18"/>
-        </w:rPr>
-      </w:pPr>
-      <w:r>
-        <w:rPr>
-          <w:sz w:val="18"/>
-          <w:szCs w:val="18"/>
-        </w:rPr>
+        <w:lastRenderedPageBreak/>
         <w:t>TABLE IV</w:t>
       </w:r>
     </w:p>
@@ -12575,55 +12166,21 @@
           <w:color w:val="000000"/>
         </w:rPr>
       </w:pPr>
-      <w:bookmarkStart w:id="43" w:name="bookmark=id.3k2qzvjbn3b5" w:colFirst="0" w:colLast="0"/>
-      <w:bookmarkStart w:id="44" w:name="bookmark=id.242wa8nmpnw7" w:colFirst="0" w:colLast="0"/>
-      <w:bookmarkEnd w:id="43"/>
-      <w:bookmarkEnd w:id="44"/>
-      <w:r>
-        <w:rPr>
-          <w:color w:val="000000"/>
-        </w:rPr>
-        <w:t xml:space="preserve">Table </w:t>
-      </w:r>
-      <w:hyperlink w:anchor="_heading=h.n3l66oj7ytms">
-        <w:r>
-          <w:rPr>
-            <w:color w:val="000000"/>
-          </w:rPr>
-          <w:t>IV</w:t>
-        </w:r>
-      </w:hyperlink>
-      <w:r>
-        <w:rPr>
-          <w:color w:val="000000"/>
-        </w:rPr>
-        <w:t xml:space="preserve"> indicates that the platform’s primary performance benefit is </w:t>
-      </w:r>
-      <w:r>
-        <w:rPr>
-          <w:i/>
-          <w:iCs/>
-          <w:color w:val="000000"/>
-        </w:rPr>
-        <w:t>operational consistency</w:t>
-      </w:r>
-      <w:r>
-        <w:rPr>
-          <w:color w:val="000000"/>
-        </w:rPr>
-        <w:t>. The 10-minute synchronization schedule converts inventory updates from manual checks into deterministic cycles. The 145 ms provider-health metric suggests that health status can be surfaced frequently without excessive overhead. The sub- 100 ms API acknowledgement under concurrency confirms that asynchronous queueing protects the user experience from infrastructure runtime delays.</w:t>
-      </w:r>
-      <w:r>
-        <w:rPr>
-          <w:color w:val="000000"/>
-        </w:rPr>
-        <w:t xml:space="preserve"> </w:t>
-      </w:r>
-      <w:r>
-        <w:rPr>
-          <w:color w:val="000000"/>
-        </w:rPr>
-        <w:t>The cost row is especially relevant for governance. Instead of manually combining multiple AWS views, the platform presents a single period-specific summary where compute, storage, and network categories are directly comparable. This reduces the time between spend observation and corrective action.</w:t>
+      <w:bookmarkStart w:id="39" w:name="bookmark=id.3k2qzvjbn3b5" w:colFirst="0" w:colLast="0"/>
+      <w:bookmarkStart w:id="40" w:name="bookmark=id.242wa8nmpnw7" w:colFirst="0" w:colLast="0"/>
+      <w:bookmarkEnd w:id="39"/>
+      <w:bookmarkEnd w:id="40"/>
+      <w:r>
+        <w:rPr>
+          <w:color w:val="000000"/>
+        </w:rPr>
+        <w:t>Table IV reveals that operational consistency is the main performance advantage of the platform. The 10 minutes synchronization schedule transforms the inventory update based on manual checks to deterministic cycles. The 145 ms provider-health indicator indicates that health status can be brought to the surface on a regular basis without undue overhead. The sub- 100 ms API acknowledgement in the concurrency setting ensures that the user experience is not affected by infrastructure runtime delays due to asynchronous queueing. Cost row particularly applies to governance. The platform does not require the manual integration of several AWS views, but it displays one period-specific summary with compute, storage, and network categories that can be directly compared. This reduces the time between spend observation and corrective action</w:t>
+      </w:r>
+      <w:r>
+        <w:rPr>
+          <w:color w:val="000000"/>
+        </w:rPr>
+        <w:t>.</w:t>
       </w:r>
     </w:p>
     <w:p>
@@ -13798,8 +13355,8 @@
           <w:color w:val="000000"/>
         </w:rPr>
       </w:pPr>
-      <w:bookmarkStart w:id="45" w:name="bookmark=id.i3rlyg2g9bix" w:colFirst="0" w:colLast="0"/>
-      <w:bookmarkEnd w:id="45"/>
+      <w:bookmarkStart w:id="41" w:name="bookmark=id.i3rlyg2g9bix" w:colFirst="0" w:colLast="0"/>
+      <w:bookmarkEnd w:id="41"/>
       <w:r>
         <w:rPr>
           <w:i/>
@@ -13829,30 +13386,14 @@
         <w:rPr>
           <w:color w:val="000000"/>
         </w:rPr>
-        <w:t xml:space="preserve">Performance in orchestration systems should be interpreted as a two-layer model: control-plane responsiveness and execution-plane completion. Nebula intentionally optimizes control-plane responsiveness by acknowledging user requests quickly and delegating long-running work to Celery workers. This design aligns with published observations that queue and coordination overhead are typically smaller than provider-side provisioning latency </w:t>
-      </w:r>
-      <w:hyperlink w:anchor="_heading=h.b6agejok2tkt">
-        <w:r>
-          <w:rPr>
-            <w:color w:val="000000"/>
-          </w:rPr>
-          <w:t>[14],</w:t>
-        </w:r>
-      </w:hyperlink>
-      <w:r>
-        <w:rPr>
-          <w:color w:val="000000"/>
-        </w:rPr>
-        <w:t xml:space="preserve"> </w:t>
-      </w:r>
-      <w:hyperlink w:anchor="_heading=h.y26d5k8c08o8">
-        <w:r>
-          <w:rPr>
-            <w:color w:val="000000"/>
-          </w:rPr>
-          <w:t>[15].</w:t>
-        </w:r>
-      </w:hyperlink>
+        <w:t>The orchestration systems should be understood to have two layers of performance: control-plane responsiveness and execution-plane completion. To deliberately make control-plane responsive, Nebula responds to user requests and schedules long-running tasks to Celery workers. This architecture is consistent with known literature that queue and coordination overhead is generally less than provider-side provisioning latency [14], [15].D. Reliability and Traceability Results</w:t>
+      </w:r>
+      <w:r>
+        <w:rPr>
+          <w:color w:val="000000"/>
+        </w:rPr>
+        <w:t>.</w:t>
+      </w:r>
     </w:p>
     <w:p>
       <w:pPr>
@@ -13879,8 +13420,8 @@
           <w:color w:val="000000"/>
         </w:rPr>
       </w:pPr>
-      <w:bookmarkStart w:id="46" w:name="bookmark=id.b5zj5k1s85ot" w:colFirst="0" w:colLast="0"/>
-      <w:bookmarkEnd w:id="46"/>
+      <w:bookmarkStart w:id="42" w:name="bookmark=id.b5zj5k1s85ot" w:colFirst="0" w:colLast="0"/>
+      <w:bookmarkEnd w:id="42"/>
       <w:r>
         <w:rPr>
           <w:i/>
@@ -13910,46 +13451,13 @@
         <w:rPr>
           <w:color w:val="000000"/>
         </w:rPr>
-        <w:t>Beyond speed, the evaluated behavior shows improved traceability. Lifecycle states (</w:t>
-      </w:r>
-      <w:r>
-        <w:rPr>
-          <w:rFonts w:ascii="Courier New" w:eastAsia="Courier New" w:hAnsi="Courier New" w:cs="Courier New"/>
-          <w:color w:val="000000"/>
-        </w:rPr>
-        <w:t>pending</w:t>
-      </w:r>
-      <w:r>
-        <w:rPr>
-          <w:color w:val="000000"/>
-        </w:rPr>
-        <w:t xml:space="preserve">, </w:t>
-      </w:r>
-      <w:r>
-        <w:rPr>
-          <w:rFonts w:ascii="Courier New" w:eastAsia="Courier New" w:hAnsi="Courier New" w:cs="Courier New"/>
-          <w:color w:val="000000"/>
-        </w:rPr>
-        <w:t>provisioning</w:t>
-      </w:r>
-      <w:r>
-        <w:rPr>
-          <w:color w:val="000000"/>
-        </w:rPr>
-        <w:t xml:space="preserve">, </w:t>
-      </w:r>
-      <w:r>
-        <w:rPr>
-          <w:rFonts w:ascii="Courier New" w:eastAsia="Courier New" w:hAnsi="Courier New" w:cs="Courier New"/>
-          <w:color w:val="000000"/>
-        </w:rPr>
-        <w:t>active</w:t>
-      </w:r>
-      <w:r>
-        <w:rPr>
-          <w:color w:val="000000"/>
-        </w:rPr>
-        <w:t>) and captured logs provide a reproducible narrative for each operation. This is significant in production settings where debugging, auditability, and post-incident analysis are as important as raw completion time.</w:t>
+        <w:t>In addition to speed, the behavior under examination exhibits better traceability. Each operation has a reproducible narrative due to lifecycle states (pending, provisioning, active) and captured logs. It is important in production environments where debugging, auditability and post incident analysis are valued instead of raw completion time.E. Limitations of Current Evaluation</w:t>
+      </w:r>
+      <w:r>
+        <w:rPr>
+          <w:color w:val="000000"/>
+        </w:rPr>
+        <w:t>.</w:t>
       </w:r>
     </w:p>
     <w:p>
@@ -13977,8 +13485,8 @@
           <w:color w:val="000000"/>
         </w:rPr>
       </w:pPr>
-      <w:bookmarkStart w:id="47" w:name="bookmark=id.otkr72lh04t8" w:colFirst="0" w:colLast="0"/>
-      <w:bookmarkEnd w:id="47"/>
+      <w:bookmarkStart w:id="43" w:name="bookmark=id.otkr72lh04t8" w:colFirst="0" w:colLast="0"/>
+      <w:bookmarkEnd w:id="43"/>
       <w:r>
         <w:rPr>
           <w:i/>
@@ -14008,7 +13516,7 @@
         <w:rPr>
           <w:color w:val="000000"/>
         </w:rPr>
-        <w:t>The evaluation scope is intentionally bounded. Results are derived from the AWS-backed implementation and do not yet represent cross-provider variance. In addition, some values are sample observations from project dashboards and should be interpreted as implementation evidence rather than universal benchmarks. Future evaluation can extend to repeated trial design, larger concurrency profiles, and cross-region statistical analysis.</w:t>
+        <w:t>The scope of evaluation is limited purposely. The implementation results based on AWS are obtained and have not yet become a cross-provider variance. Moreover, there are sample observations of project dashboards that should be understood as implementation evidence, but not generalized standards. The next round of assessment can be done in terms of repeated trial design, expanded concurrency profiles, and cross-region statistical analysis.</w:t>
       </w:r>
     </w:p>
     <w:p>
@@ -14030,8 +13538,8 @@
         <w:spacing w:before="152"/>
         <w:ind w:left="3992" w:hanging="488"/>
       </w:pPr>
-      <w:bookmarkStart w:id="48" w:name="bookmark=id.jrfamfy1yf5j" w:colFirst="0" w:colLast="0"/>
-      <w:bookmarkEnd w:id="48"/>
+      <w:bookmarkStart w:id="44" w:name="bookmark=id.jrfamfy1yf5j" w:colFirst="0" w:colLast="0"/>
+      <w:bookmarkEnd w:id="44"/>
       <w:r>
         <w:rPr>
           <w:smallCaps/>
@@ -14060,23 +13568,14 @@
         <w:rPr>
           <w:color w:val="000000"/>
         </w:rPr>
-        <w:t xml:space="preserve">The deployment model is designed for reproducibility, operational clarity, and incremental scale. </w:t>
-      </w:r>
-      <w:r>
-        <w:t>Containerization</w:t>
-      </w:r>
-      <w:r>
-        <w:rPr>
-          <w:color w:val="000000"/>
-        </w:rPr>
-        <w:t xml:space="preserve"> is used to ensure that service behavior remains consistent across local development and controlled staging </w:t>
+        <w:t xml:space="preserve">The deployment model is made to be reproducible, operationally clear, as well as incrementally scaled. Containerization is adopted to make sure that the behaviour of services is the same in both local development and </w:t>
       </w:r>
       <w:r>
         <w:rPr>
           <w:color w:val="000000"/>
         </w:rPr>
         <w:lastRenderedPageBreak/>
-        <w:t>environments.</w:t>
+        <w:t>controlled staging environments.</w:t>
       </w:r>
     </w:p>
     <w:p>
@@ -15944,8 +15443,19 @@
         </w:rPr>
         <w:t>. Code Trace from UI to AWS Provisioning</w:t>
       </w:r>
-      <w:bookmarkStart w:id="49" w:name="_heading=h.n3l66oj7ytms" w:colFirst="0" w:colLast="0"/>
-      <w:bookmarkEnd w:id="49"/>
+      <w:bookmarkStart w:id="45" w:name="_heading=h.n3l66oj7ytms" w:colFirst="0" w:colLast="0"/>
+      <w:bookmarkEnd w:id="45"/>
+    </w:p>
+    <w:p>
+      <w:pPr>
+        <w:spacing w:before="187"/>
+        <w:ind w:left="243" w:right="243"/>
+        <w:jc w:val="center"/>
+        <w:rPr>
+          <w:sz w:val="18"/>
+          <w:szCs w:val="18"/>
+        </w:rPr>
+      </w:pPr>
     </w:p>
     <w:p>
       <w:pPr>
@@ -15972,8 +15482,8 @@
           <w:color w:val="000000"/>
         </w:rPr>
       </w:pPr>
-      <w:bookmarkStart w:id="50" w:name="bookmark=id.fs8c7zijo452" w:colFirst="0" w:colLast="0"/>
-      <w:bookmarkEnd w:id="50"/>
+      <w:bookmarkStart w:id="46" w:name="bookmark=id.fs8c7zijo452" w:colFirst="0" w:colLast="0"/>
+      <w:bookmarkEnd w:id="46"/>
       <w:r>
         <w:rPr>
           <w:i/>
@@ -16016,30 +15526,13 @@
         <w:rPr>
           <w:color w:val="000000"/>
         </w:rPr>
-        <w:t>. This launches frontend, backend API, PostgreSQL, Redis, and Celery worker services in an isolated network. The workflow supports rapid environment bring-up while preserving deterministic service dependencies.</w:t>
-      </w:r>
-    </w:p>
-    <w:p>
-      <w:pPr>
-        <w:pBdr>
-          <w:top w:val="nil"/>
-          <w:left w:val="nil"/>
-          <w:bottom w:val="nil"/>
-          <w:right w:val="nil"/>
-          <w:between w:val="nil"/>
-        </w:pBdr>
-        <w:spacing w:before="8"/>
-        <w:ind w:left="478"/>
-        <w:jc w:val="both"/>
-        <w:rPr>
-          <w:color w:val="000000"/>
-        </w:rPr>
-      </w:pPr>
-      <w:r>
-        <w:rPr>
-          <w:color w:val="000000"/>
-        </w:rPr>
-        <w:t>From an operational standpoint, this pattern offers three advantages:</w:t>
+        <w:t xml:space="preserve">. </w:t>
+      </w:r>
+      <w:r>
+        <w:rPr>
+          <w:color w:val="000000"/>
+        </w:rPr>
+        <w:t>This implements frontend, backend API, PostgreSQL, Redis, and Celery worker services in a different network. The workflow helps in rapid bring-up of the environment and ensures the deterministic service dependencies. This trend has three advantages operationally:</w:t>
       </w:r>
     </w:p>
     <w:p>
@@ -16169,8 +15662,8 @@
           <w:color w:val="000000"/>
         </w:rPr>
       </w:pPr>
-      <w:bookmarkStart w:id="51" w:name="bookmark=id.jx5xf6y011w" w:colFirst="0" w:colLast="0"/>
-      <w:bookmarkEnd w:id="51"/>
+      <w:bookmarkStart w:id="47" w:name="bookmark=id.jx5xf6y011w" w:colFirst="0" w:colLast="0"/>
+      <w:bookmarkEnd w:id="47"/>
       <w:r>
         <w:rPr>
           <w:i/>
@@ -16200,7 +15693,25 @@
         <w:rPr>
           <w:color w:val="000000"/>
         </w:rPr>
-        <w:t>The currently validated provisioning pipeline is AWS-specific. Resource synchronization, health checks, and cost retrieval operate on AWS resource classes (EC2, S3, VPC), and Terraform execution paths are bound to AWS modules in the current release. This constrained scope is intentional: stability and observability are prioritized before broader provider expansion.</w:t>
+        <w:t>The provisioning pipeline that has been validated at this point is AWS-specific</w:t>
+      </w:r>
+      <w:r>
+        <w:rPr>
+          <w:color w:val="000000"/>
+        </w:rPr>
+        <w:t xml:space="preserve">. Resource synchronization, health checks, and cost retrieval operate on AWS resource classes (EC2, S3, VPC), and Terraform execution paths are bound to AWS modules in the current release. </w:t>
+      </w:r>
+      <w:r>
+        <w:rPr>
+          <w:color w:val="000000"/>
+        </w:rPr>
+        <w:t>This is designed to be a narrow scope: stability and observability are initially given priority and a more significant increase of providers comes afterwards</w:t>
+      </w:r>
+      <w:r>
+        <w:rPr>
+          <w:color w:val="000000"/>
+        </w:rPr>
+        <w:t>.</w:t>
       </w:r>
     </w:p>
     <w:p>
@@ -16257,7 +15768,7 @@
         <w:rPr>
           <w:color w:val="000000"/>
         </w:rPr>
-        <w:t>For production-grade reliability, deployment workflows should include environment-variable governance, creden- tial rotation policy, worker-level monitoring, and backup strategy for persistent stores. The current implementation already establishes a base for these controls through modular service boundaries and explicit task routing.</w:t>
+        <w:t>In order to have production grade reliability, environment-variable governance, credential rotation policy, worker-level monitoring and backup strategy of persistent stores must be included in the deployment workflows. These are already in implementation with a foundation already in place with modular service boundaries and explicit task routing.</w:t>
       </w:r>
     </w:p>
     <w:p>
@@ -16285,8 +15796,8 @@
           <w:color w:val="000000"/>
         </w:rPr>
       </w:pPr>
-      <w:bookmarkStart w:id="52" w:name="bookmark=id.84u79f8x74jn" w:colFirst="0" w:colLast="0"/>
-      <w:bookmarkEnd w:id="52"/>
+      <w:bookmarkStart w:id="48" w:name="bookmark=id.84u79f8x74jn" w:colFirst="0" w:colLast="0"/>
+      <w:bookmarkEnd w:id="48"/>
       <w:r>
         <w:rPr>
           <w:i/>
@@ -16316,7 +15827,7 @@
         <w:rPr>
           <w:color w:val="000000"/>
         </w:rPr>
-        <w:t>Horizontal scaling is achieved at the worker layer. As request volume increases, additional Celery workers can be attached to the Redis queue to process provisioning and synchronization tasks in parallel. This allows throughput growth while keeping the API layer responsive and predictable.</w:t>
+        <w:t>At the worker layer, horizontal scaling is attained. As the number of requests to provisioning and synchronization increases, more Celery workers can be added to the Redis queue to serve them, and it is possible to run them at the same time. This enables the throughput to increase without making the API layer unresponsive.</w:t>
       </w:r>
     </w:p>
     <w:p>
@@ -16344,8 +15855,8 @@
           <w:color w:val="000000"/>
         </w:rPr>
       </w:pPr>
-      <w:bookmarkStart w:id="53" w:name="bookmark=id.kqiw1mv6v6je" w:colFirst="0" w:colLast="0"/>
-      <w:bookmarkEnd w:id="53"/>
+      <w:bookmarkStart w:id="49" w:name="bookmark=id.kqiw1mv6v6je" w:colFirst="0" w:colLast="0"/>
+      <w:bookmarkEnd w:id="49"/>
       <w:r>
         <w:rPr>
           <w:i/>
@@ -16375,7 +15886,13 @@
         <w:rPr>
           <w:color w:val="000000"/>
         </w:rPr>
-        <w:t>In this project phase, risk and challenge management is framed as an explicit future-scope roadmap rather than a closed evaluation result. The roadmap emphasizes operational hardening and governance maturity.</w:t>
+        <w:t>Risk and challenge management in this project stage is formulated as an open roadmap of the future rather than a definitive ending. The roadmap is concerned with operations and governance maturity hardening</w:t>
+      </w:r>
+      <w:r>
+        <w:rPr>
+          <w:color w:val="000000"/>
+        </w:rPr>
+        <w:t>.</w:t>
       </w:r>
     </w:p>
     <w:p>
@@ -16511,7 +16028,14 @@
         <w:rPr>
           <w:color w:val="000000"/>
         </w:rPr>
-        <w:t>: integrate pre-apply policy checks to block non-compliant configuration before resource creation.</w:t>
+        <w:t xml:space="preserve">: integrate pre-apply policy checks to block non-compliant configuration before </w:t>
+      </w:r>
+      <w:r>
+        <w:rPr>
+          <w:color w:val="000000"/>
+        </w:rPr>
+        <w:lastRenderedPageBreak/>
+        <w:t>resource creation.</w:t>
       </w:r>
     </w:p>
     <w:p>
@@ -16539,7 +16063,6 @@
           <w:bCs/>
           <w:color w:val="000000"/>
         </w:rPr>
-        <w:lastRenderedPageBreak/>
         <w:t>Compliance Traceability</w:t>
       </w:r>
       <w:r>
@@ -16573,8 +16096,8 @@
           <w:color w:val="000000"/>
         </w:rPr>
       </w:pPr>
-      <w:bookmarkStart w:id="54" w:name="bookmark=id.4jn9quehu8w2" w:colFirst="0" w:colLast="0"/>
-      <w:bookmarkEnd w:id="54"/>
+      <w:bookmarkStart w:id="50" w:name="bookmark=id.4jn9quehu8w2" w:colFirst="0" w:colLast="0"/>
+      <w:bookmarkEnd w:id="50"/>
       <w:r>
         <w:rPr>
           <w:i/>
@@ -16766,8 +16289,8 @@
           <w:color w:val="000000"/>
         </w:rPr>
       </w:pPr>
-      <w:bookmarkStart w:id="55" w:name="bookmark=id.rzardjlwwx9f" w:colFirst="0" w:colLast="0"/>
-      <w:bookmarkEnd w:id="55"/>
+      <w:bookmarkStart w:id="51" w:name="bookmark=id.rzardjlwwx9f" w:colFirst="0" w:colLast="0"/>
+      <w:bookmarkEnd w:id="51"/>
       <w:r>
         <w:rPr>
           <w:i/>
@@ -16797,8 +16320,25 @@
         <w:rPr>
           <w:color w:val="000000"/>
         </w:rPr>
-        <w:t>Future academic work can evaluate comparative outcomes across providers, perform longitudinal drift studies, and test decision-support effectiveness of AI-guided optimization against manual operator baselines. These directions would strengthen external validity while preserving the implementation-centered approach introduced in this paper.</w:t>
-      </w:r>
+        <w:t>The relative performance among providers can be evaluated in the future through academic practice, longitudinal drift studies can be conducted, and the effectiveness of AI-driven optimization in decision-support can be compared to that of manual operators. These guidelines would increase the external validity and would nevertheless not deter the implementation-oriented nature of the approach suggested in this paper. In this paper, Nebula was presented as an AWS-oriented orchestration strategy to standardize the infrastructure operations in the aspects of provisioning, synchronization, health control, and cost visibility. The most important fact was that the operational maturity of cloud systems is not only connected to the degree of automation, but also the consistency of execution paths and the quality of observability. Through an evaluation based on an implementation, the study demonstrated that a layered control-plane architecture is capable of keeping user-facing responsiveness and offload infrastructure runtime asynchronous workers. As the reported values of the project environment (synchronization cadence, provider-health latency, lifecycle traceability, service-level cost breakdown) indicate, the point that the high degree of standardization can be achieved in the conditions of the real life is justified.</w:t>
+      </w:r>
+    </w:p>
+    <w:p>
+      <w:pPr>
+        <w:pBdr>
+          <w:top w:val="nil"/>
+          <w:left w:val="nil"/>
+          <w:bottom w:val="nil"/>
+          <w:right w:val="nil"/>
+          <w:between w:val="nil"/>
+        </w:pBdr>
+        <w:spacing w:before="79" w:line="252" w:lineRule="auto"/>
+        <w:ind w:left="259" w:right="257" w:firstLine="219"/>
+        <w:jc w:val="both"/>
+        <w:rPr>
+          <w:color w:val="000000"/>
+        </w:rPr>
+      </w:pPr>
     </w:p>
     <w:p>
       <w:pPr>
@@ -16819,49 +16359,14 @@
         <w:spacing w:before="129"/>
         <w:ind w:left="5045" w:hanging="571"/>
       </w:pPr>
-      <w:bookmarkStart w:id="56" w:name="bookmark=id.xwh8ioo13s9p" w:colFirst="0" w:colLast="0"/>
-      <w:bookmarkEnd w:id="56"/>
+      <w:bookmarkStart w:id="52" w:name="bookmark=id.xwh8ioo13s9p" w:colFirst="0" w:colLast="0"/>
+      <w:bookmarkEnd w:id="52"/>
       <w:r>
         <w:rPr>
           <w:smallCaps/>
           <w:color w:val="000000"/>
         </w:rPr>
         <w:t>Conclusion</w:t>
-      </w:r>
-    </w:p>
-    <w:p>
-      <w:pPr>
-        <w:pBdr>
-          <w:top w:val="nil"/>
-          <w:left w:val="nil"/>
-          <w:bottom w:val="nil"/>
-          <w:right w:val="nil"/>
-          <w:between w:val="nil"/>
-        </w:pBdr>
-        <w:spacing w:before="79" w:line="252" w:lineRule="auto"/>
-        <w:ind w:left="259" w:right="257" w:firstLine="219"/>
-        <w:jc w:val="both"/>
-        <w:rPr>
-          <w:color w:val="000000"/>
-        </w:rPr>
-      </w:pPr>
-      <w:r>
-        <w:rPr>
-          <w:color w:val="000000"/>
-        </w:rPr>
-        <w:t>This paper presented Nebula as an AWS-focused orchestration approach for standardizing infrastructure operations across provisioning, synchronization, health monitoring, and cost visibility. The central argument was that operational maturity in cloud systems depends not only on automation volume, but on consistency of execution pathways and observability quality.</w:t>
-      </w:r>
-      <w:r>
-        <w:rPr>
-          <w:color w:val="000000"/>
-        </w:rPr>
-        <w:t xml:space="preserve"> </w:t>
-      </w:r>
-      <w:r>
-        <w:rPr>
-          <w:color w:val="000000"/>
-        </w:rPr>
-        <w:t>Through an implementation-driven evaluation, the study demonstrated that a layered control-plane architecture can preserve fast user-facing responsiveness while delegating infrastructure runtime to asynchronous workers. Reported values from the project environment (including synchronization cadence, provider-health latency, lifecycle traceability, and service-level cost breakdown) support the claim that meaningful standardization can be achieved in practical settings.</w:t>
       </w:r>
     </w:p>
     <w:p>
@@ -16884,32 +16389,25 @@
         <w:rPr>
           <w:color w:val="000000"/>
         </w:rPr>
-        <w:t>The work also contributes a pragmatic research posture: rather than overextending into partially validated cross- cloud claims, it establishes a deep AWS baseline with reproducible workflow evidence. This baseline provides a stronger foundation for future extension than broad conceptual architectures with limited operational data.</w:t>
-      </w:r>
-      <w:r>
-        <w:rPr>
-          <w:color w:val="000000"/>
-        </w:rPr>
-        <w:t xml:space="preserve"> </w:t>
-      </w:r>
-      <w:r>
-        <w:rPr>
-          <w:color w:val="000000"/>
-        </w:rPr>
-        <w:t>The current limitations are clear. Results are bounded to AWS implementation scope and sample operational observations. Nevertheless, the architecture and governance model are intentionally designed for systematic expansion. Future iterations will focus on risk-hardening, policy enforcement, richer real-time feedback, and controlled extension to additional providers.</w:t>
-      </w:r>
-      <w:r>
-        <w:rPr>
-          <w:color w:val="000000"/>
-        </w:rPr>
-        <w:t xml:space="preserve"> </w:t>
-      </w:r>
-      <w:r>
-        <w:rPr>
-          <w:color w:val="000000"/>
-        </w:rPr>
-        <w:t>In summary, Nebula shows that democratizing cloud operations is less about hiding complexity and more about structuring it into reliable, auditable, and repeatable workflows.</w:t>
-      </w:r>
+        <w:t>The article also introduces a pragmatic research spirit: rather than what may be projected to half baked cross- cloud enunciations, it develops a radical AWS foundation with repeatable workflow findings. This foundation is more expandable in the future as compared to conceptual architectures that have meager operational information. The existing restrictions are evident. The results are limited to the implementation of AWS and observations of the sample operations. Nevertheless, the system and structure of government is tactically oriented towards systematic development. The second generation will focus on risk-hardening, policy enforcement, more comprehensive real-time feedback and controlled extrapolation to other providers. Generally, Nebula proves that democratization of cloud operations is not about making the complexity less visible but rather making it structured into predictable, verifiable and repeatable work processes.</w:t>
+      </w:r>
+    </w:p>
+    <w:p>
+      <w:pPr>
+        <w:pBdr>
+          <w:top w:val="nil"/>
+          <w:left w:val="nil"/>
+          <w:bottom w:val="nil"/>
+          <w:right w:val="nil"/>
+          <w:between w:val="nil"/>
+        </w:pBdr>
+        <w:spacing w:before="2" w:line="252" w:lineRule="auto"/>
+        <w:ind w:left="259" w:right="257" w:firstLine="219"/>
+        <w:jc w:val="both"/>
+        <w:rPr>
+          <w:color w:val="000000"/>
+        </w:rPr>
+      </w:pPr>
     </w:p>
     <w:p>
       <w:pPr>
@@ -16967,6 +16465,23 @@
           <w:right w:val="nil"/>
           <w:between w:val="nil"/>
         </w:pBdr>
+        <w:spacing w:before="83" w:line="252" w:lineRule="auto"/>
+        <w:ind w:left="259" w:right="257" w:firstLine="219"/>
+        <w:jc w:val="both"/>
+        <w:rPr>
+          <w:color w:val="000000"/>
+        </w:rPr>
+      </w:pPr>
+    </w:p>
+    <w:p>
+      <w:pPr>
+        <w:pBdr>
+          <w:top w:val="nil"/>
+          <w:left w:val="nil"/>
+          <w:bottom w:val="nil"/>
+          <w:right w:val="nil"/>
+          <w:between w:val="nil"/>
+        </w:pBdr>
         <w:spacing w:before="150"/>
         <w:ind w:left="243" w:right="243"/>
         <w:jc w:val="center"/>
@@ -17104,13 +16619,14 @@
           <w:color w:val="000000"/>
         </w:rPr>
       </w:pPr>
-      <w:bookmarkStart w:id="57" w:name="bookmark=id.jytfykiza0g2" w:colFirst="0" w:colLast="0"/>
-      <w:bookmarkEnd w:id="57"/>
+      <w:bookmarkStart w:id="53" w:name="bookmark=id.jytfykiza0g2" w:colFirst="0" w:colLast="0"/>
+      <w:bookmarkEnd w:id="53"/>
       <w:r>
         <w:rPr>
           <w:smallCaps/>
           <w:color w:val="000000"/>
         </w:rPr>
+        <w:lastRenderedPageBreak/>
         <w:t>References</w:t>
       </w:r>
     </w:p>
@@ -17137,8 +16653,8 @@
           <w:color w:val="000000"/>
         </w:rPr>
       </w:pPr>
-      <w:bookmarkStart w:id="58" w:name="_heading=h.93o68whk52rm" w:colFirst="0" w:colLast="0"/>
-      <w:bookmarkEnd w:id="58"/>
+      <w:bookmarkStart w:id="54" w:name="_heading=h.93o68whk52rm" w:colFirst="0" w:colLast="0"/>
+      <w:bookmarkEnd w:id="54"/>
       <w:r>
         <w:t>Q. Zhang, L. Cheng, and R. Boutaba, “Cloud computing: state-of-the-art and research challenges,” Journal of Internet Services and Applications, vol. 1, no. 1, pp. 7–18, 2010.</w:t>
       </w:r>
@@ -17165,8 +16681,8 @@
           <w:color w:val="000000"/>
         </w:rPr>
       </w:pPr>
-      <w:bookmarkStart w:id="59" w:name="_heading=h.m8sji24l8fj4" w:colFirst="0" w:colLast="0"/>
-      <w:bookmarkEnd w:id="59"/>
+      <w:bookmarkStart w:id="55" w:name="_heading=h.m8sji24l8fj4" w:colFirst="0" w:colLast="0"/>
+      <w:bookmarkEnd w:id="55"/>
       <w:r>
         <w:rPr>
           <w:color w:val="000000"/>
@@ -17211,8 +16727,8 @@
           <w:color w:val="000000"/>
         </w:rPr>
       </w:pPr>
-      <w:bookmarkStart w:id="60" w:name="_heading=h.78yluc5vwk53" w:colFirst="0" w:colLast="0"/>
-      <w:bookmarkEnd w:id="60"/>
+      <w:bookmarkStart w:id="56" w:name="_heading=h.78yluc5vwk53" w:colFirst="0" w:colLast="0"/>
+      <w:bookmarkEnd w:id="56"/>
       <w:r>
         <w:rPr>
           <w:color w:val="000000"/>
@@ -17257,14 +16773,10 @@
           <w:color w:val="000000"/>
         </w:rPr>
       </w:pPr>
-      <w:bookmarkStart w:id="61" w:name="_heading=h.hzrkl3v6dsv1" w:colFirst="0" w:colLast="0"/>
-      <w:bookmarkEnd w:id="61"/>
-      <w:r>
-        <w:t xml:space="preserve">R. Buyya, C. S. Yeo, S. Venugopal, J. Broberg, and I. Brandic, “Cloud computing and emerging IT platforms: </w:t>
-      </w:r>
-      <w:r>
-        <w:lastRenderedPageBreak/>
-        <w:t>Vision, hype, and reality for delivering computing as the 5th utility,” Future Generation Computer Systems, vol. 25, no. 6, pp. 599–616, 2009.</w:t>
+      <w:bookmarkStart w:id="57" w:name="_heading=h.hzrkl3v6dsv1" w:colFirst="0" w:colLast="0"/>
+      <w:bookmarkEnd w:id="57"/>
+      <w:r>
+        <w:t>R. Buyya, C. S. Yeo, S. Venugopal, J. Broberg, and I. Brandic, “Cloud computing and emerging IT platforms: Vision, hype, and reality for delivering computing as the 5th utility,” Future Generation Computer Systems, vol. 25, no. 6, pp. 599–616, 2009.</w:t>
       </w:r>
     </w:p>
     <w:p>
@@ -17290,8 +16802,8 @@
           <w:color w:val="000000"/>
         </w:rPr>
       </w:pPr>
-      <w:bookmarkStart w:id="62" w:name="_heading=h.ovrshcu8zn3y" w:colFirst="0" w:colLast="0"/>
-      <w:bookmarkEnd w:id="62"/>
+      <w:bookmarkStart w:id="58" w:name="_heading=h.ovrshcu8zn3y" w:colFirst="0" w:colLast="0"/>
+      <w:bookmarkEnd w:id="58"/>
       <w:r>
         <w:t>A. Khajeh-Hosseini, D. Greenwood, J. W. Smith, and I. Sommerville, “The Cloud Adoption Toolkit: supporting cloud adoption decisions in the enterprise,” Software: Practice and Experience, vol. 42, no. 4, pp. 447–465, 2012.</w:t>
       </w:r>
@@ -17319,8 +16831,8 @@
           <w:color w:val="000000"/>
         </w:rPr>
       </w:pPr>
-      <w:bookmarkStart w:id="63" w:name="_heading=h.22cr1jz84h0f" w:colFirst="0" w:colLast="0"/>
-      <w:bookmarkEnd w:id="63"/>
+      <w:bookmarkStart w:id="59" w:name="_heading=h.22cr1jz84h0f" w:colFirst="0" w:colLast="0"/>
+      <w:bookmarkEnd w:id="59"/>
       <w:r>
         <w:t>A. N. Toosi, R. N. Calheiros, and R. Buyya, “Interconnected cloud computing environments: Challenges, taxonomy, and survey,” ACM Computing Surveys, vol. 47, no. 1, pp. 1–47, 2014.</w:t>
       </w:r>
@@ -17348,8 +16860,8 @@
           <w:color w:val="000000"/>
         </w:rPr>
       </w:pPr>
-      <w:bookmarkStart w:id="64" w:name="_heading=h.s3m4cwls3uen" w:colFirst="0" w:colLast="0"/>
-      <w:bookmarkEnd w:id="64"/>
+      <w:bookmarkStart w:id="60" w:name="_heading=h.s3m4cwls3uen" w:colFirst="0" w:colLast="0"/>
+      <w:bookmarkEnd w:id="60"/>
       <w:r>
         <w:rPr>
           <w:color w:val="000000"/>
@@ -17370,7 +16882,7 @@
         </w:rPr>
         <w:t xml:space="preserve">, 2024. [Online]. Available: </w:t>
       </w:r>
-      <w:hyperlink r:id="rId7">
+      <w:hyperlink r:id="rId8">
         <w:r>
           <w:rPr>
             <w:color w:val="000000"/>
@@ -17402,8 +16914,8 @@
           <w:color w:val="000000"/>
         </w:rPr>
       </w:pPr>
-      <w:bookmarkStart w:id="65" w:name="_heading=h.tae7l93nslfo" w:colFirst="0" w:colLast="0"/>
-      <w:bookmarkEnd w:id="65"/>
+      <w:bookmarkStart w:id="61" w:name="_heading=h.tae7l93nslfo" w:colFirst="0" w:colLast="0"/>
+      <w:bookmarkEnd w:id="61"/>
       <w:r>
         <w:rPr>
           <w:i/>
@@ -17418,7 +16930,7 @@
         </w:rPr>
         <w:t xml:space="preserve">, 2024. [Online]. Available: </w:t>
       </w:r>
-      <w:hyperlink r:id="rId8">
+      <w:hyperlink r:id="rId9">
         <w:r>
           <w:rPr>
             <w:color w:val="000000"/>
@@ -17450,8 +16962,8 @@
           <w:color w:val="000000"/>
         </w:rPr>
       </w:pPr>
-      <w:bookmarkStart w:id="66" w:name="_heading=h.rqrjnuf6t0qz" w:colFirst="0" w:colLast="0"/>
-      <w:bookmarkEnd w:id="66"/>
+      <w:bookmarkStart w:id="62" w:name="_heading=h.rqrjnuf6t0qz" w:colFirst="0" w:colLast="0"/>
+      <w:bookmarkEnd w:id="62"/>
       <w:r>
         <w:t>M. Armbrust et al., “A view of cloud computing,” Communications of the ACM, vol. 53, no. 4, pp. 50–58, 2010.</w:t>
       </w:r>
@@ -17479,8 +16991,8 @@
           <w:color w:val="000000"/>
         </w:rPr>
       </w:pPr>
-      <w:bookmarkStart w:id="67" w:name="_heading=h.s3m7wbhzs775" w:colFirst="0" w:colLast="0"/>
-      <w:bookmarkEnd w:id="67"/>
+      <w:bookmarkStart w:id="63" w:name="_heading=h.s3m7wbhzs775" w:colFirst="0" w:colLast="0"/>
+      <w:bookmarkEnd w:id="63"/>
       <w:r>
         <w:rPr>
           <w:color w:val="000000"/>
@@ -17539,8 +17051,8 @@
           <w:color w:val="000000"/>
         </w:rPr>
       </w:pPr>
-      <w:bookmarkStart w:id="68" w:name="_heading=h.jl69zv5gkgqj" w:colFirst="0" w:colLast="0"/>
-      <w:bookmarkEnd w:id="68"/>
+      <w:bookmarkStart w:id="64" w:name="_heading=h.jl69zv5gkgqj" w:colFirst="0" w:colLast="0"/>
+      <w:bookmarkEnd w:id="64"/>
       <w:r>
         <w:t>D. Bernstein, E. Ludvigson, K. Sankar, S. Diamond, and M. Morrow, “Inter-cloud computing,” in 2009 IEEE International Conference on Cloud Computing, pp. 74–80, 2009.</w:t>
       </w:r>
@@ -17568,8 +17080,8 @@
           <w:color w:val="000000"/>
         </w:rPr>
       </w:pPr>
-      <w:bookmarkStart w:id="69" w:name="_heading=h.dcndrt3syw78" w:colFirst="0" w:colLast="0"/>
-      <w:bookmarkEnd w:id="69"/>
+      <w:bookmarkStart w:id="65" w:name="_heading=h.dcndrt3syw78" w:colFirst="0" w:colLast="0"/>
+      <w:bookmarkEnd w:id="65"/>
       <w:r>
         <w:rPr>
           <w:color w:val="000000"/>
@@ -17600,8 +17112,8 @@
           <w:color w:val="000000"/>
         </w:rPr>
       </w:pPr>
-      <w:bookmarkStart w:id="70" w:name="_heading=h.b6agejok2tkt" w:colFirst="0" w:colLast="0"/>
-      <w:bookmarkEnd w:id="70"/>
+      <w:bookmarkStart w:id="66" w:name="_heading=h.b6agejok2tkt" w:colFirst="0" w:colLast="0"/>
+      <w:bookmarkEnd w:id="66"/>
       <w:r>
         <w:t>R. N. Calheiros, R. Ranjan, A. Beloglazov, C. A. F. De Rose, and R. Buyya, “CloudSim: A toolkit for modeling and simulation of cloud computing environments and evaluation of resource provisioning algorithms,” Software: Practice and Experience, vol. 41, no. 1, pp. 23–50, 2011.</w:t>
       </w:r>
@@ -17629,8 +17141,8 @@
           <w:color w:val="000000"/>
         </w:rPr>
       </w:pPr>
-      <w:bookmarkStart w:id="71" w:name="_heading=h.y26d5k8c08o8" w:colFirst="0" w:colLast="0"/>
-      <w:bookmarkEnd w:id="71"/>
+      <w:bookmarkStart w:id="67" w:name="_heading=h.y26d5k8c08o8" w:colFirst="0" w:colLast="0"/>
+      <w:bookmarkEnd w:id="67"/>
       <w:r>
         <w:t>Y. Al-Dhuraibi, F. Paraiso, N. Djarallah, and P. Merle, “Elasticity in cloud computing: state of the art and research challenges,” IEEE Transactions on Services Computing, vol. 11, no. 2, pp. 430–447, 2018.</w:t>
       </w:r>
@@ -17659,14 +17171,14 @@
           <w:color w:val="000000"/>
         </w:rPr>
       </w:pPr>
-      <w:bookmarkStart w:id="72" w:name="_heading=h.g2l9x7dw94pk" w:colFirst="0" w:colLast="0"/>
-      <w:bookmarkEnd w:id="72"/>
+      <w:bookmarkStart w:id="68" w:name="_heading=h.g2l9x7dw94pk" w:colFirst="0" w:colLast="0"/>
+      <w:bookmarkEnd w:id="68"/>
       <w:r>
         <w:t>Y. Brikman, Terraform: Up &amp; Running: Writing Infrastructure as Code. O'Reilly Media, 2019.</w:t>
       </w:r>
     </w:p>
-    <w:bookmarkStart w:id="73" w:name="_heading=h.ua8satmn7nmq" w:colFirst="0" w:colLast="0"/>
-    <w:bookmarkEnd w:id="73"/>
+    <w:bookmarkStart w:id="69" w:name="_heading=h.ua8satmn7nmq" w:colFirst="0" w:colLast="0"/>
+    <w:bookmarkEnd w:id="69"/>
     <w:p>
       <w:pPr>
         <w:numPr>
@@ -17735,8 +17247,8 @@
           <w:color w:val="000000"/>
         </w:rPr>
       </w:pPr>
-      <w:bookmarkStart w:id="74" w:name="_heading=h.51fzq4rjykob" w:colFirst="0" w:colLast="0"/>
-      <w:bookmarkEnd w:id="74"/>
+      <w:bookmarkStart w:id="70" w:name="_heading=h.51fzq4rjykob" w:colFirst="0" w:colLast="0"/>
+      <w:bookmarkEnd w:id="70"/>
       <w:r>
         <w:t>L. M. Vaquero, L. Rodero-Merino, J. Caceres, and M. Lindner, “A break in the clouds: towards a cloud definition,” ACM SIGCOMM Computer Communication Review, vol. 39, no. 1, pp. 50–55, 2008.</w:t>
       </w:r>
@@ -17764,8 +17276,8 @@
           <w:color w:val="000000"/>
         </w:rPr>
       </w:pPr>
-      <w:bookmarkStart w:id="75" w:name="_heading=h.dg6hft20ttd9" w:colFirst="0" w:colLast="0"/>
-      <w:bookmarkEnd w:id="75"/>
+      <w:bookmarkStart w:id="71" w:name="_heading=h.dg6hft20ttd9" w:colFirst="0" w:colLast="0"/>
+      <w:bookmarkEnd w:id="71"/>
       <w:r>
         <w:t>N. Grozev and R. Buyya, “Inter-Cloud architectures and application brokering: taxonomy and survey,” Software: Practice and Experience, vol. 44, no. 3, pp. 369–390, 2014.</w:t>
       </w:r>
@@ -17793,8 +17305,8 @@
           <w:color w:val="000000"/>
         </w:rPr>
       </w:pPr>
-      <w:bookmarkStart w:id="76" w:name="_heading=h.6jx81zk26b37" w:colFirst="0" w:colLast="0"/>
-      <w:bookmarkEnd w:id="76"/>
+      <w:bookmarkStart w:id="72" w:name="_heading=h.6jx81zk26b37" w:colFirst="0" w:colLast="0"/>
+      <w:bookmarkEnd w:id="72"/>
       <w:r>
         <w:t>A. Beloglazov, J. Abawajy, and R. Buyya, “Energy-aware resource allocation heuristics for efficient management of data centers for cloud computing,” Future Generation Computer Systems, vol. 28, no. 5, pp. 755–768, 2012.</w:t>
       </w:r>
@@ -17823,8 +17335,8 @@
           <w:color w:val="000000"/>
         </w:rPr>
       </w:pPr>
-      <w:bookmarkStart w:id="77" w:name="_heading=h.moysswa52r7p" w:colFirst="0" w:colLast="0"/>
-      <w:bookmarkEnd w:id="77"/>
+      <w:bookmarkStart w:id="73" w:name="_heading=h.moysswa52r7p" w:colFirst="0" w:colLast="0"/>
+      <w:bookmarkEnd w:id="73"/>
       <w:r>
         <w:t>A. Beloglazov and R. Buyya, “Energy efficient resource management in virtualized cloud data centers,” IEEE Transactions on Cloud Computing, vol. 1, no. 1, pp. 14–28, 2013.</w:t>
       </w:r>
@@ -17882,8 +17394,8 @@
           <w:color w:val="000000"/>
         </w:rPr>
       </w:pPr>
-      <w:bookmarkStart w:id="78" w:name="_heading=h.tmk5zdg8aoiy" w:colFirst="0" w:colLast="0"/>
-      <w:bookmarkEnd w:id="78"/>
+      <w:bookmarkStart w:id="74" w:name="_heading=h.tmk5zdg8aoiy" w:colFirst="0" w:colLast="0"/>
+      <w:bookmarkEnd w:id="74"/>
       <w:r>
         <w:rPr>
           <w:color w:val="000000"/>
@@ -17904,7 +17416,7 @@
         </w:rPr>
         <w:t xml:space="preserve">, 2024. [Online]. Available: </w:t>
       </w:r>
-      <w:hyperlink r:id="rId9">
+      <w:hyperlink r:id="rId10">
         <w:r>
           <w:rPr>
             <w:color w:val="000000"/>
@@ -17918,7 +17430,7 @@
         </w:rPr>
         <w:t xml:space="preserve"> </w:t>
       </w:r>
-      <w:hyperlink r:id="rId10">
+      <w:hyperlink r:id="rId11">
         <w:r>
           <w:rPr>
             <w:color w:val="000000"/>
@@ -17949,8 +17461,8 @@
           <w:color w:val="000000"/>
         </w:rPr>
       </w:pPr>
-      <w:bookmarkStart w:id="79" w:name="_heading=h.mr56mf9woazb" w:colFirst="0" w:colLast="0"/>
-      <w:bookmarkEnd w:id="79"/>
+      <w:bookmarkStart w:id="75" w:name="_heading=h.mr56mf9woazb" w:colFirst="0" w:colLast="0"/>
+      <w:bookmarkEnd w:id="75"/>
       <w:r>
         <w:rPr>
           <w:color w:val="000000"/>
@@ -17971,7 +17483,7 @@
         </w:rPr>
         <w:t xml:space="preserve">, 2026. [Online]. Available: </w:t>
       </w:r>
-      <w:hyperlink r:id="rId11">
+      <w:hyperlink r:id="rId12">
         <w:r>
           <w:rPr>
             <w:color w:val="000000"/>
@@ -18003,8 +17515,8 @@
           <w:color w:val="000000"/>
         </w:rPr>
       </w:pPr>
-      <w:bookmarkStart w:id="80" w:name="_heading=h.fmlb0xso3ei0" w:colFirst="0" w:colLast="0"/>
-      <w:bookmarkEnd w:id="80"/>
+      <w:bookmarkStart w:id="76" w:name="_heading=h.fmlb0xso3ei0" w:colFirst="0" w:colLast="0"/>
+      <w:bookmarkEnd w:id="76"/>
       <w:r>
         <w:rPr>
           <w:color w:val="000000"/>
@@ -18025,7 +17537,7 @@
         </w:rPr>
         <w:t xml:space="preserve">, 2026. [Online]. Available: </w:t>
       </w:r>
-      <w:hyperlink r:id="rId12">
+      <w:hyperlink r:id="rId13">
         <w:r>
           <w:rPr>
             <w:color w:val="000000"/>
@@ -18057,8 +17569,8 @@
           <w:color w:val="000000"/>
         </w:rPr>
       </w:pPr>
-      <w:bookmarkStart w:id="81" w:name="_heading=h.noxh19b4xi73" w:colFirst="0" w:colLast="0"/>
-      <w:bookmarkEnd w:id="81"/>
+      <w:bookmarkStart w:id="77" w:name="_heading=h.noxh19b4xi73" w:colFirst="0" w:colLast="0"/>
+      <w:bookmarkEnd w:id="77"/>
       <w:r>
         <w:rPr>
           <w:color w:val="000000"/>
@@ -18079,7 +17591,7 @@
         </w:rPr>
         <w:t xml:space="preserve">, 2026. [Online]. Available: </w:t>
       </w:r>
-      <w:hyperlink r:id="rId13">
+      <w:hyperlink r:id="rId14">
         <w:r>
           <w:rPr>
             <w:color w:val="000000"/>
@@ -18111,8 +17623,8 @@
           <w:color w:val="000000"/>
         </w:rPr>
       </w:pPr>
-      <w:bookmarkStart w:id="82" w:name="_heading=h.ejxlu6inyh25" w:colFirst="0" w:colLast="0"/>
-      <w:bookmarkEnd w:id="82"/>
+      <w:bookmarkStart w:id="78" w:name="_heading=h.ejxlu6inyh25" w:colFirst="0" w:colLast="0"/>
+      <w:bookmarkEnd w:id="78"/>
       <w:r>
         <w:rPr>
           <w:color w:val="000000"/>
@@ -18133,7 +17645,7 @@
         </w:rPr>
         <w:t xml:space="preserve">, 2026. [Online]. Available: </w:t>
       </w:r>
-      <w:hyperlink r:id="rId14">
+      <w:hyperlink r:id="rId15">
         <w:r>
           <w:rPr>
             <w:color w:val="000000"/>
@@ -18165,8 +17677,8 @@
           <w:color w:val="000000"/>
         </w:rPr>
       </w:pPr>
-      <w:bookmarkStart w:id="83" w:name="_heading=h.67shg4jojwft" w:colFirst="0" w:colLast="0"/>
-      <w:bookmarkEnd w:id="83"/>
+      <w:bookmarkStart w:id="79" w:name="_heading=h.67shg4jojwft" w:colFirst="0" w:colLast="0"/>
+      <w:bookmarkEnd w:id="79"/>
       <w:r>
         <w:rPr>
           <w:color w:val="000000"/>
@@ -18187,7 +17699,7 @@
         </w:rPr>
         <w:t xml:space="preserve">, 2026. [Online]. Available: </w:t>
       </w:r>
-      <w:hyperlink r:id="rId15">
+      <w:hyperlink r:id="rId16">
         <w:r>
           <w:rPr>
             <w:color w:val="000000"/>
@@ -18220,8 +17732,8 @@
           <w:color w:val="000000"/>
         </w:rPr>
       </w:pPr>
-      <w:bookmarkStart w:id="84" w:name="_heading=h.c0nta5hcj9m0" w:colFirst="0" w:colLast="0"/>
-      <w:bookmarkEnd w:id="84"/>
+      <w:bookmarkStart w:id="80" w:name="_heading=h.c0nta5hcj9m0" w:colFirst="0" w:colLast="0"/>
+      <w:bookmarkEnd w:id="80"/>
       <w:r>
         <w:rPr>
           <w:color w:val="000000"/>
@@ -18242,7 +17754,7 @@
         </w:rPr>
         <w:t xml:space="preserve">, 2026. [Online]. Available: </w:t>
       </w:r>
-      <w:hyperlink r:id="rId16">
+      <w:hyperlink r:id="rId17">
         <w:r>
           <w:rPr>
             <w:color w:val="000000"/>
@@ -18256,7 +17768,7 @@
         </w:rPr>
         <w:t xml:space="preserve"> </w:t>
       </w:r>
-      <w:hyperlink r:id="rId17">
+      <w:hyperlink r:id="rId18">
         <w:r>
           <w:rPr>
             <w:color w:val="000000"/>
@@ -18288,8 +17800,8 @@
           <w:color w:val="000000"/>
         </w:rPr>
       </w:pPr>
-      <w:bookmarkStart w:id="85" w:name="_heading=h.1huwlgydgkd6" w:colFirst="0" w:colLast="0"/>
-      <w:bookmarkEnd w:id="85"/>
+      <w:bookmarkStart w:id="81" w:name="_heading=h.1huwlgydgkd6" w:colFirst="0" w:colLast="0"/>
+      <w:bookmarkEnd w:id="81"/>
       <w:r>
         <w:rPr>
           <w:i/>
@@ -18304,7 +17816,7 @@
         </w:rPr>
         <w:t xml:space="preserve">, 2026. [Online]. Available: </w:t>
       </w:r>
-      <w:hyperlink r:id="rId18">
+      <w:hyperlink r:id="rId19">
         <w:r>
           <w:rPr>
             <w:color w:val="000000"/>
@@ -18356,7 +17868,7 @@
         </w:rPr>
         <w:t xml:space="preserve">, 2026. [Online]. Available: </w:t>
       </w:r>
-      <w:hyperlink r:id="rId19">
+      <w:hyperlink r:id="rId20">
         <w:r>
           <w:rPr>
             <w:color w:val="000000"/>
@@ -20055,7 +19567,6 @@
   <w:style w:type="character" w:default="1" w:styleId="DefaultParagraphFont">
     <w:name w:val="Default Paragraph Font"/>
     <w:uiPriority w:val="1"/>
-    <w:semiHidden/>
     <w:unhideWhenUsed/>
   </w:style>
   <w:style w:type="table" w:default="1" w:styleId="TableNormal">
@@ -20549,28 +20060,28 @@
 </file>
 
 <file path=customXml/item1.xml><?xml version="1.0" encoding="utf-8"?>
+<b:Sources xmlns:b="http://schemas.openxmlformats.org/officeDocument/2006/bibliography" xmlns="http://schemas.openxmlformats.org/officeDocument/2006/bibliography" SelectedStyle="\APASixthEditionOfficeOnline.xsl" StyleName="APA" Version="6"/>
+</file>
+
+<file path=customXml/item2.xml><?xml version="1.0" encoding="utf-8"?>
 <go:gDocsCustomXmlDataStorage xmlns:go="http://customooxmlschemas.google.com/" xmlns:r="http://schemas.openxmlformats.org/officeDocument/2006/relationships" uri="GoogleDocsCustomDataVersion2">
   <go:docsCustomData xmlns:go="http://customooxmlschemas.google.com/" roundtripDataSignature="AMtx7mjh8OnmQu0/Dcov2dIKINdF+M5sjg==">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</go:docsCustomData>
 </go:gDocsCustomXmlDataStorage>
 </file>
 
-<file path=customXml/item2.xml><?xml version="1.0" encoding="utf-8"?>
-<b:Sources xmlns:b="http://schemas.openxmlformats.org/officeDocument/2006/bibliography" xmlns="http://schemas.openxmlformats.org/officeDocument/2006/bibliography" SelectedStyle="\APASixthEditionOfficeOnline.xsl" StyleName="APA" Version="6"/>
+<file path=customXml/itemProps1.xml><?xml version="1.0" encoding="utf-8"?>
+<ds:datastoreItem xmlns:ds="http://schemas.openxmlformats.org/officeDocument/2006/customXml" ds:itemID="{6CB6FA6D-4E87-4335-A0B2-868A8DE6065B}">
+  <ds:schemaRefs>
+    <ds:schemaRef ds:uri="http://schemas.openxmlformats.org/officeDocument/2006/bibliography"/>
+  </ds:schemaRefs>
+</ds:datastoreItem>
 </file>
 
-<file path=customXml/itemProps1.xml><?xml version="1.0" encoding="utf-8"?>
+<file path=customXml/itemProps2.xml><?xml version="1.0" encoding="utf-8"?>
 <ds:datastoreItem xmlns:ds="http://schemas.openxmlformats.org/officeDocument/2006/customXml" ds:itemID="{11111111-1234-1234-1234-123412341234}">
   <ds:schemaRefs>
     <ds:schemaRef ds:uri="http://customooxmlschemas.google.com/"/>
     <ds:schemaRef ds:uri="http://schemas.openxmlformats.org/officeDocument/2006/relationships"/>
   </ds:schemaRefs>
 </ds:datastoreItem>
-</file>
-
-<file path=customXml/itemProps2.xml><?xml version="1.0" encoding="utf-8"?>
-<ds:datastoreItem xmlns:ds="http://schemas.openxmlformats.org/officeDocument/2006/customXml" ds:itemID="{6CB6FA6D-4E87-4335-A0B2-868A8DE6065B}">
-  <ds:schemaRefs>
-    <ds:schemaRef ds:uri="http://schemas.openxmlformats.org/officeDocument/2006/bibliography"/>
-  </ds:schemaRefs>
-</ds:datastoreItem>
 </file>
</xml_diff>